<commit_message>
feat(inbox/aan): Book 02 NAC briefing deck + figure write-back
New 26-slide Book 02 briefing built per the series authoring spec:
FedRAMP Moderate only, Date Code on title + all footers, full sourced
speaker notes on every slide, five build sequences (identity gap 2-step,
auth stack 3-step, SCEP enrollment 4-step, policy tiers 3-step, phased
rollout 2-step). Deck deployed to OneDrive alongside the docx.

Spec section 4 write-back (3 augments; 7 existing nac-figs cover the
rest as skips):
- nac-fig-08 voice VLAN precedent (assertion vs proof) — new figure for
  the Voice VLAN Precedent section
- nac-fig-09 802.1X authentication stack — new figure for the
  Authentication Stack section
- nac-fig-10 federal physical access reality — new figure for the
  Physical Access Reality section
Book Date Code 2026-07-07 10:17 ET; docx re-rendered from qmd.

Co-Authored-By: Claude Fable 5 <noreply@anthropic.com>
</commit_message>
<xml_diff>
--- a/inbox/Application Aware Networking/Book_02_FedAAN_Network_Access_Control_802_1X.docx
+++ b/inbox/Application Aware Networking/Book_02_FedAAN_Network_Access_Control_802_1X.docx
@@ -31,7 +31,7 @@
         <w:pStyle w:val="Date"/>
       </w:pPr>
       <w:r>
-        <w:t xml:space="preserve">2026-07-05</w:t>
+        <w:t xml:space="preserve">Invalid Date</w:t>
       </w:r>
     </w:p>
     <w:sdt>
@@ -114,7 +114,7 @@
                     <a:graphicData uri="http://schemas.openxmlformats.org/drawingml/2006/picture">
                       <pic:pic>
                         <pic:nvPicPr>
-                          <pic:cNvPr descr="/opt/quarto/share/formats/docx/warning.png" id="11" name="Picture"/>
+                          <pic:cNvPr descr="C:\Program Files\Quarto\share\formats\docx\warning.png" id="11" name="Picture"/>
                           <pic:cNvPicPr>
                             <a:picLocks noChangeArrowheads="1" noChangeAspect="1"/>
                           </pic:cNvPicPr>
@@ -174,7 +174,7 @@
               <w:pStyle w:val="BodyText"/>
             </w:pPr>
             <w:pPr>
-              <w:spacing w:before="16" w:after="16"/>
+              <w:spacing w:before="16"/>
             </w:pPr>
             <w:r>
               <w:t xml:space="preserve">This document is a</w:t>
@@ -207,6 +207,27 @@
             </w:r>
             <w:r>
               <w:t xml:space="preserve">. It is an attempt at a comprehensive SSA-wide technical roadmap and has not been reviewed or approved by the SSA CIO Office, the Office of Information Security (OIS), or organizational leadership. All recommendations, vendor selections, control mappings, and implementation timelines are subject to revision pending formal review by the SSA CIO Office and organizational components.</w:t>
+            </w:r>
+          </w:p>
+          <w:p>
+            <w:pPr>
+              <w:pStyle w:val="BodyText"/>
+            </w:pPr>
+            <w:pPr>
+              <w:spacing w:after="16"/>
+            </w:pPr>
+            <w:r>
+              <w:rPr>
+                <w:b/>
+                <w:bCs/>
+              </w:rPr>
+              <w:t xml:space="preserve">Date Code:</w:t>
+            </w:r>
+            <w:r>
+              <w:t xml:space="preserve"> </w:t>
+            </w:r>
+            <w:r>
+              <w:t xml:space="preserve">2026-07-07 10:17 ET</w:t>
             </w:r>
           </w:p>
           <w:p/>
@@ -267,7 +288,7 @@
                     <a:graphicData uri="http://schemas.openxmlformats.org/drawingml/2006/picture">
                       <pic:pic>
                         <pic:nvPicPr>
-                          <pic:cNvPr descr="/opt/quarto/share/formats/docx/important.png" id="14" name="Picture"/>
+                          <pic:cNvPr descr="C:\Program Files\Quarto\share\formats\docx\important.png" id="14" name="Picture"/>
                           <pic:cNvPicPr>
                             <a:picLocks noChangeArrowheads="1" noChangeAspect="1"/>
                           </pic:cNvPicPr>
@@ -548,7 +569,7 @@
                     <a:graphicData uri="http://schemas.openxmlformats.org/drawingml/2006/picture">
                       <pic:pic>
                         <pic:nvPicPr>
-                          <pic:cNvPr descr="/opt/quarto/share/formats/docx/note.png" id="17" name="Picture"/>
+                          <pic:cNvPr descr="C:\Program Files\Quarto\share\formats\docx\note.png" id="17" name="Picture"/>
                           <pic:cNvPicPr>
                             <a:picLocks noChangeArrowheads="1" noChangeAspect="1"/>
                           </pic:cNvPicPr>
@@ -674,7 +695,7 @@
       </w:tr>
     </w:tbl>
     <w:bookmarkEnd w:id="18"/>
-    <w:bookmarkStart w:id="26" w:name="the-device-identity-gap"/>
+    <w:bookmarkStart w:id="30" w:name="the-device-identity-gap"/>
     <w:p>
       <w:pPr>
         <w:pStyle w:val="Heading1"/>
@@ -797,7 +818,7 @@
       </w:r>
     </w:p>
     <w:bookmarkEnd w:id="19"/>
-    <w:bookmarkStart w:id="20" w:name="the-federal-physical-access-reality"/>
+    <w:bookmarkStart w:id="24" w:name="the-federal-physical-access-reality"/>
     <w:p>
       <w:pPr>
         <w:pStyle w:val="Heading2"/>
@@ -930,16 +951,6 @@
       </w:pPr>
       <w:r>
         <w:t xml:space="preserve">Each of these is a live network connection with no authentication gate. NAC with 802.1X makes the authentication gate the switch port itself — independent of the physical access regime.</w:t>
-      </w:r>
-    </w:p>
-    <w:bookmarkEnd w:id="20"/>
-    <w:bookmarkStart w:id="25" w:name="Xf9e6daf1b34bf021916e30a128f36862b57d1d2"/>
-    <w:p>
-      <w:pPr>
-        <w:pStyle w:val="Heading2"/>
-      </w:pPr>
-      <w:r>
-        <w:t xml:space="preserve">2.3 Before and After: The Structural Comparison</w:t>
       </w:r>
     </w:p>
     <w:tbl>
@@ -955,7 +966,7 @@
       <w:tr>
         <w:tc>
           <w:tcPr/>
-          <w:bookmarkStart w:id="24" w:name="fig-nac01"/>
+          <w:bookmarkStart w:id="23" w:name="fig-nac10"/>
           <w:p>
             <w:pPr>
               <w:pStyle w:val="Compact"/>
@@ -966,18 +977,18 @@
                 <wp:inline>
                   <wp:extent cx="5334000" cy="3000375"/>
                   <wp:effectExtent b="0" l="0" r="0" t="0"/>
-                  <wp:docPr descr="" title="" id="22" name="Picture"/>
+                  <wp:docPr descr="" title="" id="21" name="Picture"/>
                   <a:graphic>
                     <a:graphicData uri="http://schemas.openxmlformats.org/drawingml/2006/picture">
                       <pic:pic>
                         <pic:nvPicPr>
-                          <pic:cNvPr descr="figs/nac-fig-01-before-after.png" id="23" name="Picture"/>
+                          <pic:cNvPr descr="figs/nac-fig-10-physical-access-reality.png" id="22" name="Picture"/>
                           <pic:cNvPicPr>
                             <a:picLocks noChangeArrowheads="1" noChangeAspect="1"/>
                           </pic:cNvPicPr>
                         </pic:nvPicPr>
                         <pic:blipFill>
-                          <a:blip r:embed="rId21"/>
+                          <a:blip r:embed="rId20"/>
                           <a:stretch>
                             <a:fillRect/>
                           </a:stretch>
@@ -1014,754 +1025,21 @@
               <w:pStyle w:val="ImageCaption"/>
             </w:pPr>
             <w:r>
-              <w:t xml:space="preserve">Figure 1: Before and after NAC deployment showing unauthenticated port access versus 802.1X authenticated admission flow</w:t>
-            </w:r>
-          </w:p>
-          <w:bookmarkEnd w:id="24"/>
+              <w:t xml:space="preserve">Figure 1: The federal physical access reality — five exposure classes where a facility badge is the only gate</w:t>
+            </w:r>
+          </w:p>
+          <w:bookmarkEnd w:id="23"/>
         </w:tc>
       </w:tr>
     </w:tbl>
-    <w:p>
-      <w:pPr>
-        <w:pStyle w:val="BodyText"/>
-      </w:pPr>
-      <w:r>
-        <w:rPr>
-          <w:b/>
-          <w:bCs/>
-        </w:rPr>
-        <w:t xml:space="preserve">Before this document</w:t>
-      </w:r>
-      <w:r>
-        <w:t xml:space="preserve"> </w:t>
-      </w:r>
-      <w:r>
-        <w:t xml:space="preserve">— a device connecting to any SSA switch port in a managed facility receives network access determined solely by VLAN configuration on the port. No device identity assertion is required. Physical access to the facility is the only gate.</w:t>
-      </w:r>
-    </w:p>
-    <w:p>
-      <w:pPr>
-        <w:pStyle w:val="BodyText"/>
-      </w:pPr>
-      <w:r>
-        <w:rPr>
-          <w:b/>
-          <w:bCs/>
-        </w:rPr>
-        <w:t xml:space="preserve">After this document</w:t>
-      </w:r>
-      <w:r>
-        <w:t xml:space="preserve"> </w:t>
-      </w:r>
-      <w:r>
-        <w:t xml:space="preserve">— every switch port and wireless access point requires a valid machine certificate issued to an Entra-enrolled device. Devices that cannot present a valid certificate are placed in a quarantine VLAN. Devices that present a valid certificate from a non-compliant device (patch compliance failure, AV disabled) are placed in a remediation VLAN. Only devices that are enrolled, compliant, and certificate-valid receive access to the production VLAN.</w:t>
-      </w:r>
-    </w:p>
-    <w:bookmarkEnd w:id="25"/>
-    <w:bookmarkEnd w:id="26"/>
-    <w:bookmarkStart w:id="27" w:name="the-voice-vlan-precedent"/>
-    <w:p>
-      <w:pPr>
-        <w:pStyle w:val="Heading1"/>
-      </w:pPr>
-      <w:r>
-        <w:t xml:space="preserve">3. The Voice VLAN Precedent</w:t>
-      </w:r>
-    </w:p>
-    <w:p>
-      <w:pPr>
-        <w:pStyle w:val="FirstParagraph"/>
-      </w:pPr>
-      <w:r>
-        <w:t xml:space="preserve">Network Access Control did not begin with 802.1X. It began, in production networks, with a telephone.</w:t>
-      </w:r>
-    </w:p>
-    <w:p>
-      <w:pPr>
-        <w:pStyle w:val="BodyText"/>
-      </w:pPr>
-      <w:r>
-        <w:t xml:space="preserve">When IP telephony arrived in the late 1990s — before IEEE 802.1X-2001 was ratified, and years before supplicant software was broadly deployable — every desk deployment faced the same problem NAC solves today: two very different device classes, a phone and a workstation, sharing the same wall jack, requiring different network segments, different QoS treatment, and different access scope. The mechanism that solved it was not an authentication protocol. It was DHCP. A phone booting on the data VLAN sent a DHCP request that declared its device class — the vendor class identifier in option 60, and a characteristic pattern of requested options. The DHCP server recognized the class and answered with vendor-specific options carrying the voice VLAN ID and the address of the configuration server. The phone released its data-VLAN lease, re-tagged its traffic onto the voice VLAN, and requested a new address there. The switch never authenticated anything; the</w:t>
-      </w:r>
-      <w:r>
-        <w:t xml:space="preserve"> </w:t>
-      </w:r>
-      <w:r>
-        <w:rPr>
-          <w:i/>
-          <w:iCs/>
-        </w:rPr>
-        <w:t xml:space="preserve">naming and addressing plane</w:t>
-      </w:r>
-      <w:r>
-        <w:t xml:space="preserve"> </w:t>
-      </w:r>
-      <w:r>
-        <w:t xml:space="preserve">identified the device and the network differentiated its admission accordingly.</w:t>
-      </w:r>
-    </w:p>
-    <w:p>
-      <w:pPr>
-        <w:pStyle w:val="BodyText"/>
-      </w:pPr>
-      <w:r>
-        <w:t xml:space="preserve">This is the structural precedent for everything in this document. Voice VLAN steering was the earliest production case of the pattern NAC generalizes: a device asserts an identity, an authoritative service classifies it, and the network assigns it a segment scoped to its function — before the device touches any production resource. Every element of the modern NAC policy tier structure is visible in embryo: device classification (option 60 fingerprint), differentiated VLAN assignment (voice vs. data), and function-scoped access (the phone reaches call control, not file shares). The DHCP server was acting as a policy decision point a decade before that term entered the architecture vocabulary.</w:t>
-      </w:r>
-    </w:p>
-    <w:p>
-      <w:pPr>
-        <w:pStyle w:val="BodyText"/>
-      </w:pPr>
-      <w:r>
-        <w:t xml:space="preserve">The precedent also carried a structural weakness, and naming it precisely is what motivates the rest of this document:</w:t>
-      </w:r>
-      <w:r>
-        <w:t xml:space="preserve"> </w:t>
-      </w:r>
-      <w:r>
-        <w:rPr>
-          <w:b/>
-          <w:bCs/>
-        </w:rPr>
-        <w:t xml:space="preserve">DHCP option-based steering is identity by assertion, not by proof.</w:t>
-      </w:r>
-      <w:r>
-        <w:t xml:space="preserve"> </w:t>
-      </w:r>
-      <w:r>
-        <w:t xml:space="preserve">Any device can transmit a phone’s vendor class identifier; nothing in the exchange is cryptographically verified. That is acceptable for QoS steering, where the worst case of a false claim is mis-prioritized traffic. It is not acceptable for access control, where the worst case is an unauthorized device in a production segment. 802.1X with EAP-TLS replaces the assertion with a proof — a machine certificate whose private key never leaves the device — while the assertion-based lineage survives, deliberately and in a constrained role, in two places later in this document: MAC Authentication Bypass for devices that cannot run a supplicant, and DHCP fingerprinting as the classification and anomaly-detection signal that the IPAM layer feeds back into the NAC decision. The naming and addressing plane asserted device identity first; the identity plane this book builds makes the assertion provable.</w:t>
-      </w:r>
-    </w:p>
-    <w:bookmarkEnd w:id="27"/>
-    <w:bookmarkStart w:id="36" w:name="X82c6a9b21860f42551bf826059803119df8d347"/>
-    <w:p>
-      <w:pPr>
-        <w:pStyle w:val="Heading1"/>
-      </w:pPr>
-      <w:r>
-        <w:t xml:space="preserve">4. NAC Architecture — RADIUS, 802.1X, and EAP-TLS</w:t>
-      </w:r>
-    </w:p>
-    <w:bookmarkStart w:id="28" w:name="the-authentication-stack"/>
+    <w:bookmarkEnd w:id="24"/>
+    <w:bookmarkStart w:id="29" w:name="Xf9e6daf1b34bf021916e30a128f36862b57d1d2"/>
     <w:p>
       <w:pPr>
         <w:pStyle w:val="Heading2"/>
       </w:pPr>
       <w:r>
-        <w:t xml:space="preserve">4.1 The Authentication Stack</w:t>
-      </w:r>
-    </w:p>
-    <w:p>
-      <w:pPr>
-        <w:pStyle w:val="FirstParagraph"/>
-      </w:pPr>
-      <w:r>
-        <w:t xml:space="preserve">802.1X Network Access Control is a port-based authentication framework defined in IEEE 802.1X-2020. It introduces three roles to every network admission event:</w:t>
-      </w:r>
-    </w:p>
-    <w:p>
-      <w:pPr>
-        <w:pStyle w:val="Compact"/>
-        <w:numPr>
-          <w:ilvl w:val="0"/>
-          <w:numId w:val="1002"/>
-        </w:numPr>
-      </w:pPr>
-      <w:r>
-        <w:rPr>
-          <w:b/>
-          <w:bCs/>
-        </w:rPr>
-        <w:t xml:space="preserve">Supplicant</w:t>
-      </w:r>
-      <w:r>
-        <w:t xml:space="preserve"> </w:t>
-      </w:r>
-      <w:r>
-        <w:t xml:space="preserve">— the software on the device requesting network access. On Windows, this is the built-in 802.1X supplicant configured via Intune policy. On Linux,</w:t>
-      </w:r>
-      <w:r>
-        <w:t xml:space="preserve"> </w:t>
-      </w:r>
-      <w:r>
-        <w:rPr>
-          <w:rStyle w:val="VerbatimChar"/>
-        </w:rPr>
-        <w:t xml:space="preserve">wpa_supplicant</w:t>
-      </w:r>
-      <w:r>
-        <w:t xml:space="preserve"> </w:t>
-      </w:r>
-      <w:r>
-        <w:t xml:space="preserve">is the standard. On macOS, the native supplicant is configured through MDM.</w:t>
-      </w:r>
-    </w:p>
-    <w:p>
-      <w:pPr>
-        <w:pStyle w:val="Compact"/>
-        <w:numPr>
-          <w:ilvl w:val="0"/>
-          <w:numId w:val="1002"/>
-        </w:numPr>
-      </w:pPr>
-      <w:r>
-        <w:rPr>
-          <w:b/>
-          <w:bCs/>
-        </w:rPr>
-        <w:t xml:space="preserve">Authenticator</w:t>
-      </w:r>
-      <w:r>
-        <w:t xml:space="preserve"> </w:t>
-      </w:r>
-      <w:r>
-        <w:t xml:space="preserve">— the network device that enforces access (a managed switch or wireless access point). The authenticator does not validate credentials itself; it relays the EAP exchange between the supplicant and the authentication server and enforces the VLAN assignment returned by the authentication server.</w:t>
-      </w:r>
-    </w:p>
-    <w:p>
-      <w:pPr>
-        <w:pStyle w:val="Compact"/>
-        <w:numPr>
-          <w:ilvl w:val="0"/>
-          <w:numId w:val="1002"/>
-        </w:numPr>
-      </w:pPr>
-      <w:r>
-        <w:rPr>
-          <w:b/>
-          <w:bCs/>
-        </w:rPr>
-        <w:t xml:space="preserve">Authentication Server</w:t>
-      </w:r>
-      <w:r>
-        <w:t xml:space="preserve"> </w:t>
-      </w:r>
-      <w:r>
-        <w:t xml:space="preserve">— the RADIUS server that validates the supplicant’s credentials and returns the access decision (VLAN ID, session timeout, filter rules).</w:t>
-      </w:r>
-    </w:p>
-    <w:p>
-      <w:pPr>
-        <w:pStyle w:val="FirstParagraph"/>
-      </w:pPr>
-      <w:r>
-        <w:t xml:space="preserve">The exchange protocol between supplicant and authentication server is the Extensible Authentication Protocol (EAP), carried over RADIUS between the authenticator and the authentication server.</w:t>
-      </w:r>
-    </w:p>
-    <w:bookmarkEnd w:id="28"/>
-    <w:bookmarkStart w:id="29" w:name="Xe6727c90454fe28f5c795c7f2710efc24477f82"/>
-    <w:p>
-      <w:pPr>
-        <w:pStyle w:val="Heading2"/>
-      </w:pPr>
-      <w:r>
-        <w:t xml:space="preserve">4.2 EAP Method Selection — Why EAP-TLS for Federal</w:t>
-      </w:r>
-    </w:p>
-    <w:p>
-      <w:pPr>
-        <w:pStyle w:val="FirstParagraph"/>
-      </w:pPr>
-      <w:r>
-        <w:t xml:space="preserve">NIST SP 800-120 (Recommendation for EAP Methods Used in Wireless Network Access Authentication) and NIST SP 800-153 (Guidelines for Securing Wireless Local Area Networks) both recommend EAP-TLS as the strongest EAP method for federal environments. The choice is not optional under FedRAMP Moderate:</w:t>
-      </w:r>
-    </w:p>
-    <w:p>
-      <w:pPr>
-        <w:pStyle w:val="TableCaption"/>
-      </w:pPr>
-      <w:r>
-        <w:t xml:space="preserve">EAP Method Comparison for Federal NAC</w:t>
-      </w:r>
-    </w:p>
-    <w:tbl>
-      <w:tblPr>
-        <w:tblStyle w:val="Table"/>
-        <w:tblW w:type="pct" w:w="5000"/>
-        <w:tblLayout w:type="fixed"/>
-        <w:tblLook w:firstRow="1" w:lastRow="0" w:firstColumn="0" w:lastColumn="0" w:noHBand="0" w:noVBand="0" w:val="0020"/>
-        <w:tblCaption w:val="EAP Method Comparison for Federal NAC"/>
-      </w:tblPr>
-      <w:tblGrid>
-        <w:gridCol w:w="979"/>
-        <w:gridCol w:w="898"/>
-        <w:gridCol w:w="1551"/>
-        <w:gridCol w:w="1551"/>
-        <w:gridCol w:w="1224"/>
-        <w:gridCol w:w="1714"/>
-      </w:tblGrid>
-      <w:tr>
-        <w:trPr>
-          <w:tblHeader w:val="on"/>
-        </w:trPr>
-        <w:tc>
-          <w:tcPr/>
-          <w:p>
-            <w:pPr>
-              <w:pStyle w:val="Compact"/>
-            </w:pPr>
-            <w:r>
-              <w:t xml:space="preserve">EAP Method</w:t>
-            </w:r>
-          </w:p>
-        </w:tc>
-        <w:tc>
-          <w:tcPr/>
-          <w:p>
-            <w:pPr>
-              <w:pStyle w:val="Compact"/>
-            </w:pPr>
-            <w:r>
-              <w:t xml:space="preserve">Credential</w:t>
-            </w:r>
-          </w:p>
-        </w:tc>
-        <w:tc>
-          <w:tcPr/>
-          <w:p>
-            <w:pPr>
-              <w:pStyle w:val="Compact"/>
-            </w:pPr>
-            <w:r>
-              <w:t xml:space="preserve">Server Certificate</w:t>
-            </w:r>
-          </w:p>
-        </w:tc>
-        <w:tc>
-          <w:tcPr/>
-          <w:p>
-            <w:pPr>
-              <w:pStyle w:val="Compact"/>
-            </w:pPr>
-            <w:r>
-              <w:t xml:space="preserve">Client Certificate</w:t>
-            </w:r>
-          </w:p>
-        </w:tc>
-        <w:tc>
-          <w:tcPr/>
-          <w:p>
-            <w:pPr>
-              <w:pStyle w:val="Compact"/>
-            </w:pPr>
-            <w:r>
-              <w:t xml:space="preserve">FIPS Approved</w:t>
-            </w:r>
-          </w:p>
-        </w:tc>
-        <w:tc>
-          <w:tcPr/>
-          <w:p>
-            <w:pPr>
-              <w:pStyle w:val="Compact"/>
-            </w:pPr>
-            <w:r>
-              <w:t xml:space="preserve">Federal Suitability</w:t>
-            </w:r>
-          </w:p>
-        </w:tc>
-      </w:tr>
-      <w:tr>
-        <w:tc>
-          <w:tcPr/>
-          <w:p>
-            <w:pPr>
-              <w:pStyle w:val="Compact"/>
-            </w:pPr>
-            <w:r>
-              <w:t xml:space="preserve">EAP-PEAP/MSCHAPv2</w:t>
-            </w:r>
-          </w:p>
-        </w:tc>
-        <w:tc>
-          <w:tcPr/>
-          <w:p>
-            <w:pPr>
-              <w:pStyle w:val="Compact"/>
-            </w:pPr>
-            <w:r>
-              <w:t xml:space="preserve">Password</w:t>
-            </w:r>
-          </w:p>
-        </w:tc>
-        <w:tc>
-          <w:tcPr/>
-          <w:p>
-            <w:pPr>
-              <w:pStyle w:val="Compact"/>
-            </w:pPr>
-            <w:r>
-              <w:t xml:space="preserve">Required</w:t>
-            </w:r>
-          </w:p>
-        </w:tc>
-        <w:tc>
-          <w:tcPr/>
-          <w:p>
-            <w:pPr>
-              <w:pStyle w:val="Compact"/>
-            </w:pPr>
-            <w:r>
-              <w:t xml:space="preserve">Not required</w:t>
-            </w:r>
-          </w:p>
-        </w:tc>
-        <w:tc>
-          <w:tcPr/>
-          <w:p>
-            <w:pPr>
-              <w:pStyle w:val="Compact"/>
-            </w:pPr>
-            <w:r>
-              <w:t xml:space="preserve">No (MSCHAPv2)</w:t>
-            </w:r>
-          </w:p>
-        </w:tc>
-        <w:tc>
-          <w:tcPr/>
-          <w:p>
-            <w:pPr>
-              <w:pStyle w:val="Compact"/>
-            </w:pPr>
-            <w:r>
-              <w:t xml:space="preserve">Not acceptable — NTLM derivative</w:t>
-            </w:r>
-          </w:p>
-        </w:tc>
-      </w:tr>
-      <w:tr>
-        <w:tc>
-          <w:tcPr/>
-          <w:p>
-            <w:pPr>
-              <w:pStyle w:val="Compact"/>
-            </w:pPr>
-            <w:r>
-              <w:t xml:space="preserve">EAP-TTLS/PAP</w:t>
-            </w:r>
-          </w:p>
-        </w:tc>
-        <w:tc>
-          <w:tcPr/>
-          <w:p>
-            <w:pPr>
-              <w:pStyle w:val="Compact"/>
-            </w:pPr>
-            <w:r>
-              <w:t xml:space="preserve">Password</w:t>
-            </w:r>
-          </w:p>
-        </w:tc>
-        <w:tc>
-          <w:tcPr/>
-          <w:p>
-            <w:pPr>
-              <w:pStyle w:val="Compact"/>
-            </w:pPr>
-            <w:r>
-              <w:t xml:space="preserve">Required</w:t>
-            </w:r>
-          </w:p>
-        </w:tc>
-        <w:tc>
-          <w:tcPr/>
-          <w:p>
-            <w:pPr>
-              <w:pStyle w:val="Compact"/>
-            </w:pPr>
-            <w:r>
-              <w:t xml:space="preserve">Not required</w:t>
-            </w:r>
-          </w:p>
-        </w:tc>
-        <w:tc>
-          <w:tcPr/>
-          <w:p>
-            <w:pPr>
-              <w:pStyle w:val="Compact"/>
-            </w:pPr>
-            <w:r>
-              <w:t xml:space="preserve">No</w:t>
-            </w:r>
-          </w:p>
-        </w:tc>
-        <w:tc>
-          <w:tcPr/>
-          <w:p>
-            <w:pPr>
-              <w:pStyle w:val="Compact"/>
-            </w:pPr>
-            <w:r>
-              <w:t xml:space="preserve">Not acceptable — plaintext credential in tunnel</w:t>
-            </w:r>
-          </w:p>
-        </w:tc>
-      </w:tr>
-      <w:tr>
-        <w:tc>
-          <w:tcPr/>
-          <w:p>
-            <w:pPr>
-              <w:pStyle w:val="Compact"/>
-            </w:pPr>
-            <w:r>
-              <w:t xml:space="preserve">EAP-PEAP/EAP-TLS</w:t>
-            </w:r>
-          </w:p>
-        </w:tc>
-        <w:tc>
-          <w:tcPr/>
-          <w:p>
-            <w:pPr>
-              <w:pStyle w:val="Compact"/>
-            </w:pPr>
-            <w:r>
-              <w:t xml:space="preserve">Certificate</w:t>
-            </w:r>
-          </w:p>
-        </w:tc>
-        <w:tc>
-          <w:tcPr/>
-          <w:p>
-            <w:pPr>
-              <w:pStyle w:val="Compact"/>
-            </w:pPr>
-            <w:r>
-              <w:t xml:space="preserve">Required</w:t>
-            </w:r>
-          </w:p>
-        </w:tc>
-        <w:tc>
-          <w:tcPr/>
-          <w:p>
-            <w:pPr>
-              <w:pStyle w:val="Compact"/>
-            </w:pPr>
-            <w:r>
-              <w:t xml:space="preserve">Required</w:t>
-            </w:r>
-          </w:p>
-        </w:tc>
-        <w:tc>
-          <w:tcPr/>
-          <w:p>
-            <w:pPr>
-              <w:pStyle w:val="Compact"/>
-            </w:pPr>
-            <w:r>
-              <w:t xml:space="preserve">Yes</w:t>
-            </w:r>
-          </w:p>
-        </w:tc>
-        <w:tc>
-          <w:tcPr/>
-          <w:p>
-            <w:pPr>
-              <w:pStyle w:val="Compact"/>
-            </w:pPr>
-            <w:r>
-              <w:t xml:space="preserve">Acceptable — but EAP-TLS alone is simpler</w:t>
-            </w:r>
-          </w:p>
-        </w:tc>
-      </w:tr>
-      <w:tr>
-        <w:tc>
-          <w:tcPr/>
-          <w:p>
-            <w:pPr>
-              <w:pStyle w:val="Compact"/>
-            </w:pPr>
-            <w:r>
-              <w:rPr>
-                <w:b/>
-                <w:bCs/>
-              </w:rPr>
-              <w:t xml:space="preserve">EAP-TLS</w:t>
-            </w:r>
-          </w:p>
-        </w:tc>
-        <w:tc>
-          <w:tcPr/>
-          <w:p>
-            <w:pPr>
-              <w:pStyle w:val="Compact"/>
-            </w:pPr>
-            <w:r>
-              <w:rPr>
-                <w:b/>
-                <w:bCs/>
-              </w:rPr>
-              <w:t xml:space="preserve">Certificate</w:t>
-            </w:r>
-          </w:p>
-        </w:tc>
-        <w:tc>
-          <w:tcPr/>
-          <w:p>
-            <w:pPr>
-              <w:pStyle w:val="Compact"/>
-            </w:pPr>
-            <w:r>
-              <w:rPr>
-                <w:b/>
-                <w:bCs/>
-              </w:rPr>
-              <w:t xml:space="preserve">Required</w:t>
-            </w:r>
-          </w:p>
-        </w:tc>
-        <w:tc>
-          <w:tcPr/>
-          <w:p>
-            <w:pPr>
-              <w:pStyle w:val="Compact"/>
-            </w:pPr>
-            <w:r>
-              <w:rPr>
-                <w:b/>
-                <w:bCs/>
-              </w:rPr>
-              <w:t xml:space="preserve">Required</w:t>
-            </w:r>
-          </w:p>
-        </w:tc>
-        <w:tc>
-          <w:tcPr/>
-          <w:p>
-            <w:pPr>
-              <w:pStyle w:val="Compact"/>
-            </w:pPr>
-            <w:r>
-              <w:rPr>
-                <w:b/>
-                <w:bCs/>
-              </w:rPr>
-              <w:t xml:space="preserve">Yes</w:t>
-            </w:r>
-          </w:p>
-        </w:tc>
-        <w:tc>
-          <w:tcPr/>
-          <w:p>
-            <w:pPr>
-              <w:pStyle w:val="Compact"/>
-            </w:pPr>
-            <w:r>
-              <w:rPr>
-                <w:b/>
-                <w:bCs/>
-              </w:rPr>
-              <w:t xml:space="preserve">Recommended — mutual certificate authentication</w:t>
-            </w:r>
-          </w:p>
-        </w:tc>
-      </w:tr>
-    </w:tbl>
-    <w:p>
-      <w:pPr>
-        <w:pStyle w:val="BodyText"/>
-      </w:pPr>
-      <w:r>
-        <w:t xml:space="preserve">EAP-TLS provides mutual authentication: the RADIUS server presents its certificate to the supplicant (server identity), and the supplicant presents its machine certificate to the RADIUS server (device identity). Both assertions are cryptographically verified. Neither side can be impersonated without access to the private key of the relevant certificate authority.</w:t>
-      </w:r>
-    </w:p>
-    <w:p>
-      <w:pPr>
-        <w:pStyle w:val="BodyText"/>
-      </w:pPr>
-      <w:r>
-        <w:t xml:space="preserve">This matters structurally: EAP-PEAP/MSCHAPv2, used in many legacy federal wireless deployments, is vulnerable to offline dictionary attacks against captured handshakes and rogue AP attacks (a malicious AP presents a self-signed server certificate that the supplicant accepts due to misconfigured validation). EAP-TLS with strict CA pinning eliminates both attack classes.</w:t>
-      </w:r>
-    </w:p>
-    <w:bookmarkEnd w:id="29"/>
-    <w:bookmarkStart w:id="34" w:name="X3de18886d568cb768549bf58e9356d28128105d"/>
-    <w:p>
-      <w:pPr>
-        <w:pStyle w:val="Heading2"/>
-      </w:pPr>
-      <w:r>
-        <w:t xml:space="preserve">4.3 RADIUS Server Design for Federal Environments</w:t>
-      </w:r>
-    </w:p>
-    <w:p>
-      <w:pPr>
-        <w:pStyle w:val="FirstParagraph"/>
-      </w:pPr>
-      <w:r>
-        <w:t xml:space="preserve">The RADIUS server is the authentication server in the 802.1X architecture. For SSA GCC Moderate, the recommended RADIUS implementation is</w:t>
-      </w:r>
-      <w:r>
-        <w:t xml:space="preserve"> </w:t>
-      </w:r>
-      <w:r>
-        <w:rPr>
-          <w:b/>
-          <w:bCs/>
-        </w:rPr>
-        <w:t xml:space="preserve">Microsoft Network Policy Server (NPS)</w:t>
-      </w:r>
-      <w:r>
-        <w:t xml:space="preserve"> </w:t>
-      </w:r>
-      <w:r>
-        <w:t xml:space="preserve">deployed on Windows Server 2025 in a highly available configuration, integrated with Entra ID via</w:t>
-      </w:r>
-      <w:r>
-        <w:t xml:space="preserve"> </w:t>
-      </w:r>
-      <w:r>
-        <w:rPr>
-          <w:b/>
-          <w:bCs/>
-        </w:rPr>
-        <w:t xml:space="preserve">Entra ID Certificate Authority</w:t>
-      </w:r>
-      <w:r>
-        <w:t xml:space="preserve"> </w:t>
-      </w:r>
-      <w:r>
-        <w:t xml:space="preserve">for cloud-issued device certificates.</w:t>
-      </w:r>
-    </w:p>
-    <w:p>
-      <w:pPr>
-        <w:pStyle w:val="BodyText"/>
-      </w:pPr>
-      <w:r>
-        <w:t xml:space="preserve">For agencies with existing infrastructure investment,</w:t>
-      </w:r>
-      <w:r>
-        <w:t xml:space="preserve"> </w:t>
-      </w:r>
-      <w:r>
-        <w:rPr>
-          <w:b/>
-          <w:bCs/>
-        </w:rPr>
-        <w:t xml:space="preserve">Cisco Identity Services Engine (ISE)</w:t>
-      </w:r>
-      <w:r>
-        <w:t xml:space="preserve"> </w:t>
-      </w:r>
-      <w:r>
-        <w:t xml:space="preserve">and</w:t>
-      </w:r>
-      <w:r>
-        <w:t xml:space="preserve"> </w:t>
-      </w:r>
-      <w:r>
-        <w:rPr>
-          <w:b/>
-          <w:bCs/>
-        </w:rPr>
-        <w:t xml:space="preserve">Aruba ClearPass</w:t>
-      </w:r>
-      <w:r>
-        <w:t xml:space="preserve"> </w:t>
-      </w:r>
-      <w:r>
-        <w:t xml:space="preserve">are the dominant federal alternatives; both support the same EAP-TLS + Entra integration described in this document.</w:t>
+        <w:t xml:space="preserve">2.3 Before and After: The Structural Comparison</w:t>
       </w:r>
     </w:p>
     <w:tbl>
@@ -1777,7 +1055,7 @@
       <w:tr>
         <w:tc>
           <w:tcPr/>
-          <w:bookmarkStart w:id="33" w:name="fig-nac02"/>
+          <w:bookmarkStart w:id="28" w:name="fig-nac01"/>
           <w:p>
             <w:pPr>
               <w:pStyle w:val="Compact"/>
@@ -1788,18 +1066,18 @@
                 <wp:inline>
                   <wp:extent cx="5334000" cy="3000375"/>
                   <wp:effectExtent b="0" l="0" r="0" t="0"/>
-                  <wp:docPr descr="" title="" id="31" name="Picture"/>
+                  <wp:docPr descr="" title="" id="26" name="Picture"/>
                   <a:graphic>
                     <a:graphicData uri="http://schemas.openxmlformats.org/drawingml/2006/picture">
                       <pic:pic>
                         <pic:nvPicPr>
-                          <pic:cNvPr descr="figs/nac-fig-02-radius-architecture.png" id="32" name="Picture"/>
+                          <pic:cNvPr descr="figs/nac-fig-01-before-after.png" id="27" name="Picture"/>
                           <pic:cNvPicPr>
                             <a:picLocks noChangeArrowheads="1" noChangeAspect="1"/>
                           </pic:cNvPicPr>
                         </pic:nvPicPr>
                         <pic:blipFill>
-                          <a:blip r:embed="rId30"/>
+                          <a:blip r:embed="rId25"/>
                           <a:stretch>
                             <a:fillRect/>
                           </a:stretch>
@@ -1836,10 +1114,10 @@
               <w:pStyle w:val="ImageCaption"/>
             </w:pPr>
             <w:r>
-              <w:t xml:space="preserve">Figure 2: RADIUS server architecture showing NPS in high-availability configuration with primary and secondary servers, RADIUS proxy groups for wired and wireless authenticators, and integration with Entra ID Certificate Authority and Intune Compliance API</w:t>
-            </w:r>
-          </w:p>
-          <w:bookmarkEnd w:id="33"/>
+              <w:t xml:space="preserve">Figure 2: Before and after NAC deployment showing unauthenticated port access versus 802.1X authenticated admission flow</w:t>
+            </w:r>
+          </w:p>
+          <w:bookmarkEnd w:id="28"/>
         </w:tc>
       </w:tr>
     </w:tbl>
@@ -1852,125 +1130,42 @@
           <w:b/>
           <w:bCs/>
         </w:rPr>
-        <w:t xml:space="preserve">NPS High Availability</w:t>
-      </w:r>
-      <w:r>
-        <w:t xml:space="preserve"> </w:t>
-      </w:r>
-      <w:r>
-        <w:t xml:space="preserve">— NPS does not natively replicate configuration between nodes. The standard approach for federal environments is:</w:t>
-      </w:r>
-    </w:p>
-    <w:p>
-      <w:pPr>
-        <w:pStyle w:val="Compact"/>
-        <w:numPr>
-          <w:ilvl w:val="0"/>
-          <w:numId w:val="1003"/>
-        </w:numPr>
-      </w:pPr>
-      <w:r>
-        <w:t xml:space="preserve">Deploy two NPS servers in the same region.</w:t>
-      </w:r>
-    </w:p>
-    <w:p>
-      <w:pPr>
-        <w:pStyle w:val="Compact"/>
-        <w:numPr>
-          <w:ilvl w:val="0"/>
-          <w:numId w:val="1003"/>
-        </w:numPr>
-      </w:pPr>
-      <w:r>
-        <w:t xml:space="preserve">Configure all RADIUS clients (switches, WAPs) with both servers, primary and secondary, with a 3-second failover timeout.</w:t>
-      </w:r>
-    </w:p>
-    <w:p>
-      <w:pPr>
-        <w:pStyle w:val="Compact"/>
-        <w:numPr>
-          <w:ilvl w:val="0"/>
-          <w:numId w:val="1003"/>
-        </w:numPr>
-      </w:pPr>
-      <w:r>
-        <w:t xml:space="preserve">Use a shared NPS configuration export/import script (or Group Policy) to keep policy synchronized.</w:t>
-      </w:r>
-    </w:p>
-    <w:p>
-      <w:pPr>
-        <w:pStyle w:val="Compact"/>
-        <w:numPr>
-          <w:ilvl w:val="0"/>
-          <w:numId w:val="1003"/>
-        </w:numPr>
-      </w:pPr>
-      <w:r>
-        <w:t xml:space="preserve">Monitor NPS availability with a Sentinel heartbeat alert (absence of RADIUS accounting events for &gt; 5 minutes from a production authenticator triggers a P2 alert).</w:t>
-      </w:r>
-    </w:p>
-    <w:p>
-      <w:pPr>
-        <w:pStyle w:val="FirstParagraph"/>
+        <w:t xml:space="preserve">Before this document</w:t>
+      </w:r>
+      <w:r>
+        <w:t xml:space="preserve"> </w:t>
+      </w:r>
+      <w:r>
+        <w:t xml:space="preserve">— a device connecting to any SSA switch port in a managed facility receives network access determined solely by VLAN configuration on the port. No device identity assertion is required. Physical access to the facility is the only gate.</w:t>
+      </w:r>
+    </w:p>
+    <w:p>
+      <w:pPr>
+        <w:pStyle w:val="BodyText"/>
       </w:pPr>
       <w:r>
         <w:rPr>
           <w:b/>
           <w:bCs/>
         </w:rPr>
-        <w:t xml:space="preserve">RADIUS Shared Secrets</w:t>
-      </w:r>
-      <w:r>
-        <w:t xml:space="preserve"> </w:t>
-      </w:r>
-      <w:r>
-        <w:t xml:space="preserve">— Each authenticator (switch, WAP) requires a shared secret with the RADIUS server. For federal environments:</w:t>
-      </w:r>
-    </w:p>
-    <w:p>
-      <w:pPr>
-        <w:pStyle w:val="Compact"/>
-        <w:numPr>
-          <w:ilvl w:val="0"/>
-          <w:numId w:val="1004"/>
-        </w:numPr>
-      </w:pPr>
-      <w:r>
-        <w:t xml:space="preserve">Generate secrets with 32+ characters of cryptographic randomness.</w:t>
-      </w:r>
-    </w:p>
-    <w:p>
-      <w:pPr>
-        <w:pStyle w:val="Compact"/>
-        <w:numPr>
-          <w:ilvl w:val="0"/>
-          <w:numId w:val="1004"/>
-        </w:numPr>
-      </w:pPr>
-      <w:r>
-        <w:t xml:space="preserve">Store secrets in Azure Key Vault and rotate on a 180-day schedule.</w:t>
-      </w:r>
-    </w:p>
-    <w:p>
-      <w:pPr>
-        <w:pStyle w:val="Compact"/>
-        <w:numPr>
-          <w:ilvl w:val="0"/>
-          <w:numId w:val="1004"/>
-        </w:numPr>
-      </w:pPr>
-      <w:r>
-        <w:t xml:space="preserve">Use RADIUS over TLS (RadSec, RFC 6614) where the switch/WAP firmware supports it — this replaces the shared secret model with mutual TLS between authenticator and authentication server, eliminating the weakest link in the RADIUS trust chain.</w:t>
-      </w:r>
-    </w:p>
-    <w:bookmarkEnd w:id="34"/>
-    <w:bookmarkStart w:id="35" w:name="x-port-configuration"/>
-    <w:p>
-      <w:pPr>
-        <w:pStyle w:val="Heading2"/>
-      </w:pPr>
-      <w:r>
-        <w:t xml:space="preserve">4.4 802.1X Port Configuration</w:t>
+        <w:t xml:space="preserve">After this document</w:t>
+      </w:r>
+      <w:r>
+        <w:t xml:space="preserve"> </w:t>
+      </w:r>
+      <w:r>
+        <w:t xml:space="preserve">— every switch port and wireless access point requires a valid machine certificate issued to an Entra-enrolled device. Devices that cannot present a valid certificate are placed in a quarantine VLAN. Devices that present a valid certificate from a non-compliant device (patch compliance failure, AV disabled) are placed in a remediation VLAN. Only devices that are enrolled, compliant, and certificate-valid receive access to the production VLAN.</w:t>
+      </w:r>
+    </w:p>
+    <w:bookmarkEnd w:id="29"/>
+    <w:bookmarkEnd w:id="30"/>
+    <w:bookmarkStart w:id="35" w:name="the-voice-vlan-precedent"/>
+    <w:p>
+      <w:pPr>
+        <w:pStyle w:val="Heading1"/>
+      </w:pPr>
+      <w:r>
+        <w:t xml:space="preserve">3. The Voice VLAN Precedent</w:t>
       </w:r>
     </w:p>
     <w:p>
@@ -1978,177 +1173,7 @@
         <w:pStyle w:val="FirstParagraph"/>
       </w:pPr>
       <w:r>
-        <w:t xml:space="preserve">Every managed switch port that faces an end-device (not an uplink or trunk) is configured for 802.1X authentication. The configuration specifies three possible outcomes:</w:t>
-      </w:r>
-    </w:p>
-    <w:p>
-      <w:pPr>
-        <w:pStyle w:val="SourceCode"/>
-      </w:pPr>
-      <w:r>
-        <w:rPr>
-          <w:rStyle w:val="VerbatimChar"/>
-        </w:rPr>
-        <w:t xml:space="preserve"># Cisco IOS-XE example — port facing endpoint</w:t>
-      </w:r>
-      <w:r>
-        <w:br/>
-      </w:r>
-      <w:r>
-        <w:rPr>
-          <w:rStyle w:val="VerbatimChar"/>
-        </w:rPr>
-        <w:t xml:space="preserve">interface GigabitEthernet1/0/1</w:t>
-      </w:r>
-      <w:r>
-        <w:br/>
-      </w:r>
-      <w:r>
-        <w:rPr>
-          <w:rStyle w:val="VerbatimChar"/>
-        </w:rPr>
-        <w:t xml:space="preserve"> switchport mode access</w:t>
-      </w:r>
-      <w:r>
-        <w:br/>
-      </w:r>
-      <w:r>
-        <w:rPr>
-          <w:rStyle w:val="VerbatimChar"/>
-        </w:rPr>
-        <w:t xml:space="preserve"> switchport access vlan 10          ! fallback only -- 802.1X overrides</w:t>
-      </w:r>
-      <w:r>
-        <w:br/>
-      </w:r>
-      <w:r>
-        <w:rPr>
-          <w:rStyle w:val="VerbatimChar"/>
-        </w:rPr>
-        <w:t xml:space="preserve"> authentication port-control auto   ! enable 802.1X</w:t>
-      </w:r>
-      <w:r>
-        <w:br/>
-      </w:r>
-      <w:r>
-        <w:rPr>
-          <w:rStyle w:val="VerbatimChar"/>
-        </w:rPr>
-        <w:t xml:space="preserve"> authentication host-mode multi-auth! allow phone + PC on same port</w:t>
-      </w:r>
-      <w:r>
-        <w:br/>
-      </w:r>
-      <w:r>
-        <w:rPr>
-          <w:rStyle w:val="VerbatimChar"/>
-        </w:rPr>
-        <w:t xml:space="preserve"> authentication order dot1x mab     ! try 802.1X first, then MAB</w:t>
-      </w:r>
-      <w:r>
-        <w:br/>
-      </w:r>
-      <w:r>
-        <w:rPr>
-          <w:rStyle w:val="VerbatimChar"/>
-        </w:rPr>
-        <w:t xml:space="preserve"> authentication priority dot1x mab  ! 802.1X always wins if both present</w:t>
-      </w:r>
-      <w:r>
-        <w:br/>
-      </w:r>
-      <w:r>
-        <w:rPr>
-          <w:rStyle w:val="VerbatimChar"/>
-        </w:rPr>
-        <w:t xml:space="preserve"> dot1x pae authenticator</w:t>
-      </w:r>
-      <w:r>
-        <w:br/>
-      </w:r>
-      <w:r>
-        <w:rPr>
-          <w:rStyle w:val="VerbatimChar"/>
-        </w:rPr>
-        <w:t xml:space="preserve"> dot1x timeout tx-period 10</w:t>
-      </w:r>
-      <w:r>
-        <w:br/>
-      </w:r>
-      <w:r>
-        <w:rPr>
-          <w:rStyle w:val="VerbatimChar"/>
-        </w:rPr>
-        <w:t xml:space="preserve"> dot1x max-reauth-req 3</w:t>
-      </w:r>
-      <w:r>
-        <w:br/>
-      </w:r>
-      <w:r>
-        <w:rPr>
-          <w:rStyle w:val="VerbatimChar"/>
-        </w:rPr>
-        <w:t xml:space="preserve"> spanning-tree portfast</w:t>
-      </w:r>
-      <w:r>
-        <w:br/>
-      </w:r>
-      <w:r>
-        <w:rPr>
-          <w:rStyle w:val="VerbatimChar"/>
-        </w:rPr>
-        <w:t xml:space="preserve"> ip dhcp snooping limit rate 15</w:t>
-      </w:r>
-    </w:p>
-    <w:p>
-      <w:pPr>
-        <w:pStyle w:val="FirstParagraph"/>
-      </w:pPr>
-      <w:r>
-        <w:t xml:space="preserve">The</w:t>
-      </w:r>
-      <w:r>
-        <w:t xml:space="preserve"> </w:t>
-      </w:r>
-      <w:r>
-        <w:rPr>
-          <w:rStyle w:val="VerbatimChar"/>
-        </w:rPr>
-        <w:t xml:space="preserve">authentication order dot1x mab</w:t>
-      </w:r>
-      <w:r>
-        <w:t xml:space="preserve"> </w:t>
-      </w:r>
-      <w:r>
-        <w:t xml:space="preserve">line implements the fallback sequence: the port attempts 802.1X first (30-second window for a supplicant to respond). If no 802.1X supplicant responds, the port falls back to MAC Authentication Bypass (MAB) for devices that cannot participate in 802.1X (printers, IP phones, badge readers). MAB is covered in Section 6.</w:t>
-      </w:r>
-    </w:p>
-    <w:bookmarkEnd w:id="35"/>
-    <w:bookmarkEnd w:id="36"/>
-    <w:bookmarkStart w:id="44" w:name="X2294e353f63bbf43a569a1eeee897fe8ad8488c"/>
-    <w:p>
-      <w:pPr>
-        <w:pStyle w:val="Heading1"/>
-      </w:pPr>
-      <w:r>
-        <w:t xml:space="preserve">5. Certificate Infrastructure and Device Enrollment</w:t>
-      </w:r>
-    </w:p>
-    <w:bookmarkStart w:id="37" w:name="the-certificate-trust-chain"/>
-    <w:p>
-      <w:pPr>
-        <w:pStyle w:val="Heading2"/>
-      </w:pPr>
-      <w:r>
-        <w:t xml:space="preserve">5.1 The Certificate Trust Chain</w:t>
-      </w:r>
-    </w:p>
-    <w:p>
-      <w:pPr>
-        <w:pStyle w:val="FirstParagraph"/>
-      </w:pPr>
-      <w:r>
-        <w:t xml:space="preserve">NAC with EAP-TLS requires every managed device to hold a machine certificate trusted by the RADIUS server’s CA. This certificate is distinct from the user certificate (used for user authentication to Entra ID). The machine certificate proves device identity — that this physical device is an SSA-enrolled managed endpoint — independently of which user is logged in.</w:t>
+        <w:t xml:space="preserve">Network Access Control did not begin with 802.1X. It began, in production networks, with a telephone.</w:t>
       </w:r>
     </w:p>
     <w:p>
@@ -2156,146 +1181,55 @@
         <w:pStyle w:val="BodyText"/>
       </w:pPr>
       <w:r>
-        <w:t xml:space="preserve">The certificate trust chain for SSA GCC Moderate NAC:</w:t>
-      </w:r>
-    </w:p>
-    <w:p>
-      <w:pPr>
-        <w:pStyle w:val="SourceCode"/>
-      </w:pPr>
-      <w:r>
-        <w:rPr>
-          <w:rStyle w:val="VerbatimChar"/>
-        </w:rPr>
-        <w:t xml:space="preserve">Entra ID Certificate Authority (Root)</w:t>
-      </w:r>
-      <w:r>
-        <w:br/>
-      </w:r>
-      <w:r>
-        <w:rPr>
-          <w:rStyle w:val="VerbatimChar"/>
-        </w:rPr>
-        <w:t xml:space="preserve">  └─ SSA Device Identity CA (Intermediate, deployed via Intune)</w:t>
-      </w:r>
-      <w:r>
-        <w:br/>
-      </w:r>
-      <w:r>
-        <w:rPr>
-          <w:rStyle w:val="VerbatimChar"/>
-        </w:rPr>
-        <w:t xml:space="preserve">       └─ Device Machine Certificates (issued per-device at enrollment)</w:t>
-      </w:r>
-    </w:p>
-    <w:p>
-      <w:pPr>
-        <w:pStyle w:val="FirstParagraph"/>
-      </w:pPr>
-      <w:r>
-        <w:t xml:space="preserve">The RADIUS server (NPS) is configured to trust the SSA Device Identity CA. Any device that presents a certificate signed by this CA and passes the revocation check is recognized as a managed SSA device.</w:t>
-      </w:r>
-    </w:p>
-    <w:bookmarkEnd w:id="37"/>
-    <w:bookmarkStart w:id="42" w:name="intune-scep-certificate-enrollment"/>
-    <w:p>
-      <w:pPr>
-        <w:pStyle w:val="Heading2"/>
-      </w:pPr>
-      <w:r>
-        <w:t xml:space="preserve">5.2 Intune SCEP Certificate Enrollment</w:t>
-      </w:r>
-    </w:p>
-    <w:p>
-      <w:pPr>
-        <w:pStyle w:val="FirstParagraph"/>
-      </w:pPr>
-      <w:r>
-        <w:t xml:space="preserve">Certificates are provisioned via Simple Certificate Enrollment Protocol (SCEP), configured as an Intune device configuration profile. The enrollment flow:</w:t>
-      </w:r>
-    </w:p>
-    <w:p>
-      <w:pPr>
-        <w:pStyle w:val="Compact"/>
-        <w:numPr>
-          <w:ilvl w:val="0"/>
-          <w:numId w:val="1005"/>
-        </w:numPr>
-      </w:pPr>
-      <w:r>
-        <w:t xml:space="preserve">Device completes Intune enrollment (Autopilot or manual MDM enrollment).</w:t>
-      </w:r>
-    </w:p>
-    <w:p>
-      <w:pPr>
-        <w:pStyle w:val="Compact"/>
-        <w:numPr>
-          <w:ilvl w:val="0"/>
-          <w:numId w:val="1005"/>
-        </w:numPr>
-      </w:pPr>
-      <w:r>
-        <w:t xml:space="preserve">Intune pushes the SCEP certificate profile to the device.</w:t>
-      </w:r>
-    </w:p>
-    <w:p>
-      <w:pPr>
-        <w:pStyle w:val="Compact"/>
-        <w:numPr>
-          <w:ilvl w:val="0"/>
-          <w:numId w:val="1005"/>
-        </w:numPr>
-      </w:pPr>
-      <w:r>
-        <w:t xml:space="preserve">The device generates a key pair locally (private key never leaves the device — stored in TPM where available).</w:t>
-      </w:r>
-    </w:p>
-    <w:p>
-      <w:pPr>
-        <w:pStyle w:val="Compact"/>
-        <w:numPr>
-          <w:ilvl w:val="0"/>
-          <w:numId w:val="1005"/>
-        </w:numPr>
-      </w:pPr>
-      <w:r>
-        <w:t xml:space="preserve">The device sends a SCEP certificate request to the Intune SCEP connector (NDES server or cloud SCEP).</w:t>
-      </w:r>
-    </w:p>
-    <w:p>
-      <w:pPr>
-        <w:pStyle w:val="Compact"/>
-        <w:numPr>
-          <w:ilvl w:val="0"/>
-          <w:numId w:val="1005"/>
-        </w:numPr>
-      </w:pPr>
-      <w:r>
-        <w:t xml:space="preserve">The SCEP connector forwards the request to the issuing CA after validating the Intune enrollment token.</w:t>
-      </w:r>
-    </w:p>
-    <w:p>
-      <w:pPr>
-        <w:pStyle w:val="Compact"/>
-        <w:numPr>
-          <w:ilvl w:val="0"/>
-          <w:numId w:val="1005"/>
-        </w:numPr>
-      </w:pPr>
-      <w:r>
-        <w:t xml:space="preserve">The CA issues the certificate and returns it to the device via SCEP.</w:t>
-      </w:r>
-    </w:p>
-    <w:p>
-      <w:pPr>
-        <w:pStyle w:val="Compact"/>
-        <w:numPr>
-          <w:ilvl w:val="0"/>
-          <w:numId w:val="1005"/>
-        </w:numPr>
-      </w:pPr>
-      <w:r>
-        <w:t xml:space="preserve">The device installs the certificate in the Computer certificate store (not the user store — this is critical for machine authentication to work before any user logs in).</w:t>
+        <w:t xml:space="preserve">When IP telephony arrived in the late 1990s — before IEEE 802.1X-2001 was ratified, and years before supplicant software was broadly deployable — every desk deployment faced the same problem NAC solves today: two very different device classes, a phone and a workstation, sharing the same wall jack, requiring different network segments, different QoS treatment, and different access scope. The mechanism that solved it was not an authentication protocol. It was DHCP. A phone booting on the data VLAN sent a DHCP request that declared its device class — the vendor class identifier in option 60, and a characteristic pattern of requested options. The DHCP server recognized the class and answered with vendor-specific options carrying the voice VLAN ID and the address of the configuration server. The phone released its data-VLAN lease, re-tagged its traffic onto the voice VLAN, and requested a new address there. The switch never authenticated anything; the</w:t>
+      </w:r>
+      <w:r>
+        <w:t xml:space="preserve"> </w:t>
+      </w:r>
+      <w:r>
+        <w:rPr>
+          <w:i/>
+          <w:iCs/>
+        </w:rPr>
+        <w:t xml:space="preserve">naming and addressing plane</w:t>
+      </w:r>
+      <w:r>
+        <w:t xml:space="preserve"> </w:t>
+      </w:r>
+      <w:r>
+        <w:t xml:space="preserve">identified the device and the network differentiated its admission accordingly.</w:t>
+      </w:r>
+    </w:p>
+    <w:p>
+      <w:pPr>
+        <w:pStyle w:val="BodyText"/>
+      </w:pPr>
+      <w:r>
+        <w:t xml:space="preserve">This is the structural precedent for everything in this document. Voice VLAN steering was the earliest production case of the pattern NAC generalizes: a device asserts an identity, an authoritative service classifies it, and the network assigns it a segment scoped to its function — before the device touches any production resource. Every element of the modern NAC policy tier structure is visible in embryo: device classification (option 60 fingerprint), differentiated VLAN assignment (voice vs. data), and function-scoped access (the phone reaches call control, not file shares). The DHCP server was acting as a policy decision point a decade before that term entered the architecture vocabulary.</w:t>
+      </w:r>
+    </w:p>
+    <w:p>
+      <w:pPr>
+        <w:pStyle w:val="BodyText"/>
+      </w:pPr>
+      <w:r>
+        <w:t xml:space="preserve">The precedent also carried a structural weakness, and naming it precisely is what motivates the rest of this document:</w:t>
+      </w:r>
+      <w:r>
+        <w:t xml:space="preserve"> </w:t>
+      </w:r>
+      <w:r>
+        <w:rPr>
+          <w:b/>
+          <w:bCs/>
+        </w:rPr>
+        <w:t xml:space="preserve">DHCP option-based steering is identity by assertion, not by proof.</w:t>
+      </w:r>
+      <w:r>
+        <w:t xml:space="preserve"> </w:t>
+      </w:r>
+      <w:r>
+        <w:t xml:space="preserve">Any device can transmit a phone’s vendor class identifier; nothing in the exchange is cryptographically verified. That is acceptable for QoS steering, where the worst case of a false claim is mis-prioritized traffic. It is not acceptable for access control, where the worst case is an unauthorized device in a production segment. 802.1X with EAP-TLS replaces the assertion with a proof — a machine certificate whose private key never leaves the device — while the assertion-based lineage survives, deliberately and in a constrained role, in two places later in this document: MAC Authentication Bypass for devices that cannot run a supplicant, and DHCP fingerprinting as the classification and anomaly-detection signal that the IPAM layer feeds back into the NAC decision. The naming and addressing plane asserted device identity first; the identity plane this book builds makes the assertion provable.</w:t>
       </w:r>
     </w:p>
     <w:tbl>
@@ -2311,7 +1245,7 @@
       <w:tr>
         <w:tc>
           <w:tcPr/>
-          <w:bookmarkStart w:id="41" w:name="fig-nac03"/>
+          <w:bookmarkStart w:id="34" w:name="fig-nac08"/>
           <w:p>
             <w:pPr>
               <w:pStyle w:val="Compact"/>
@@ -2322,18 +1256,18 @@
                 <wp:inline>
                   <wp:extent cx="5334000" cy="3000375"/>
                   <wp:effectExtent b="0" l="0" r="0" t="0"/>
-                  <wp:docPr descr="" title="" id="39" name="Picture"/>
+                  <wp:docPr descr="" title="" id="32" name="Picture"/>
                   <a:graphic>
                     <a:graphicData uri="http://schemas.openxmlformats.org/drawingml/2006/picture">
                       <pic:pic>
                         <pic:nvPicPr>
-                          <pic:cNvPr descr="figs/nac-fig-03-cert-enrollment.png" id="40" name="Picture"/>
+                          <pic:cNvPr descr="figs/nac-fig-08-voice-vlan-precedent.png" id="33" name="Picture"/>
                           <pic:cNvPicPr>
                             <a:picLocks noChangeArrowheads="1" noChangeAspect="1"/>
                           </pic:cNvPicPr>
                         </pic:nvPicPr>
                         <pic:blipFill>
-                          <a:blip r:embed="rId38"/>
+                          <a:blip r:embed="rId31"/>
                           <a:stretch>
                             <a:fillRect/>
                           </a:stretch>
@@ -2370,439 +1304,30 @@
               <w:pStyle w:val="ImageCaption"/>
             </w:pPr>
             <w:r>
-              <w:t xml:space="preserve">Figure 3: Certificate enrollment flow from device Intune enrollment through SCEP to machine certificate installation in the computer store</w:t>
-            </w:r>
-          </w:p>
-          <w:bookmarkEnd w:id="41"/>
+              <w:t xml:space="preserve">Figure 3: The voice VLAN precedent — identity by assertion (DHCP option 60) versus identity by proof (802.1X EAP-TLS)</w:t>
+            </w:r>
+          </w:p>
+          <w:bookmarkEnd w:id="34"/>
         </w:tc>
       </w:tr>
     </w:tbl>
-    <w:p>
-      <w:pPr>
-        <w:pStyle w:val="BodyText"/>
-      </w:pPr>
-      <w:r>
-        <w:rPr>
-          <w:b/>
-          <w:bCs/>
-        </w:rPr>
-        <w:t xml:space="preserve">Intune SCEP Profile — Key Parameters:</w:t>
-      </w:r>
-    </w:p>
-    <w:p>
-      <w:pPr>
-        <w:pStyle w:val="SourceCode"/>
-      </w:pPr>
-      <w:r>
-        <w:rPr>
-          <w:rStyle w:val="FunctionTok"/>
-        </w:rPr>
-        <w:t xml:space="preserve">{</w:t>
-      </w:r>
-      <w:r>
-        <w:br/>
-      </w:r>
-      <w:r>
-        <w:rPr>
-          <w:rStyle w:val="NormalTok"/>
-        </w:rPr>
-        <w:t xml:space="preserve">  </w:t>
-      </w:r>
-      <w:r>
-        <w:rPr>
-          <w:rStyle w:val="DataTypeTok"/>
-        </w:rPr>
-        <w:t xml:space="preserve">"certificateStore"</w:t>
-      </w:r>
-      <w:r>
-        <w:rPr>
-          <w:rStyle w:val="FunctionTok"/>
-        </w:rPr>
-        <w:t xml:space="preserve">:</w:t>
-      </w:r>
-      <w:r>
-        <w:rPr>
-          <w:rStyle w:val="NormalTok"/>
-        </w:rPr>
-        <w:t xml:space="preserve"> </w:t>
-      </w:r>
-      <w:r>
-        <w:rPr>
-          <w:rStyle w:val="StringTok"/>
-        </w:rPr>
-        <w:t xml:space="preserve">"Machine"</w:t>
-      </w:r>
-      <w:r>
-        <w:rPr>
-          <w:rStyle w:val="FunctionTok"/>
-        </w:rPr>
-        <w:t xml:space="preserve">,</w:t>
-      </w:r>
-      <w:r>
-        <w:br/>
-      </w:r>
-      <w:r>
-        <w:rPr>
-          <w:rStyle w:val="NormalTok"/>
-        </w:rPr>
-        <w:t xml:space="preserve">  </w:t>
-      </w:r>
-      <w:r>
-        <w:rPr>
-          <w:rStyle w:val="DataTypeTok"/>
-        </w:rPr>
-        <w:t xml:space="preserve">"keyUsage"</w:t>
-      </w:r>
-      <w:r>
-        <w:rPr>
-          <w:rStyle w:val="FunctionTok"/>
-        </w:rPr>
-        <w:t xml:space="preserve">:</w:t>
-      </w:r>
-      <w:r>
-        <w:rPr>
-          <w:rStyle w:val="NormalTok"/>
-        </w:rPr>
-        <w:t xml:space="preserve"> </w:t>
-      </w:r>
-      <w:r>
-        <w:rPr>
-          <w:rStyle w:val="StringTok"/>
-        </w:rPr>
-        <w:t xml:space="preserve">"DigitalSignature, KeyEncipherment"</w:t>
-      </w:r>
-      <w:r>
-        <w:rPr>
-          <w:rStyle w:val="FunctionTok"/>
-        </w:rPr>
-        <w:t xml:space="preserve">,</w:t>
-      </w:r>
-      <w:r>
-        <w:br/>
-      </w:r>
-      <w:r>
-        <w:rPr>
-          <w:rStyle w:val="NormalTok"/>
-        </w:rPr>
-        <w:t xml:space="preserve">  </w:t>
-      </w:r>
-      <w:r>
-        <w:rPr>
-          <w:rStyle w:val="DataTypeTok"/>
-        </w:rPr>
-        <w:t xml:space="preserve">"subjectNameFormat"</w:t>
-      </w:r>
-      <w:r>
-        <w:rPr>
-          <w:rStyle w:val="FunctionTok"/>
-        </w:rPr>
-        <w:t xml:space="preserve">:</w:t>
-      </w:r>
-      <w:r>
-        <w:rPr>
-          <w:rStyle w:val="NormalTok"/>
-        </w:rPr>
-        <w:t xml:space="preserve"> </w:t>
-      </w:r>
-      <w:r>
-        <w:rPr>
-          <w:rStyle w:val="StringTok"/>
-        </w:rPr>
-        <w:t xml:space="preserve">"CN={{DeviceName}}"</w:t>
-      </w:r>
-      <w:r>
-        <w:rPr>
-          <w:rStyle w:val="FunctionTok"/>
-        </w:rPr>
-        <w:t xml:space="preserve">,</w:t>
-      </w:r>
-      <w:r>
-        <w:br/>
-      </w:r>
-      <w:r>
-        <w:rPr>
-          <w:rStyle w:val="NormalTok"/>
-        </w:rPr>
-        <w:t xml:space="preserve">  </w:t>
-      </w:r>
-      <w:r>
-        <w:rPr>
-          <w:rStyle w:val="DataTypeTok"/>
-        </w:rPr>
-        <w:t xml:space="preserve">"subjectAlternativeNameType"</w:t>
-      </w:r>
-      <w:r>
-        <w:rPr>
-          <w:rStyle w:val="FunctionTok"/>
-        </w:rPr>
-        <w:t xml:space="preserve">:</w:t>
-      </w:r>
-      <w:r>
-        <w:rPr>
-          <w:rStyle w:val="NormalTok"/>
-        </w:rPr>
-        <w:t xml:space="preserve"> </w:t>
-      </w:r>
-      <w:r>
-        <w:rPr>
-          <w:rStyle w:val="StringTok"/>
-        </w:rPr>
-        <w:t xml:space="preserve">"UserPrincipalName"</w:t>
-      </w:r>
-      <w:r>
-        <w:rPr>
-          <w:rStyle w:val="FunctionTok"/>
-        </w:rPr>
-        <w:t xml:space="preserve">,</w:t>
-      </w:r>
-      <w:r>
-        <w:br/>
-      </w:r>
-      <w:r>
-        <w:rPr>
-          <w:rStyle w:val="NormalTok"/>
-        </w:rPr>
-        <w:t xml:space="preserve">  </w:t>
-      </w:r>
-      <w:r>
-        <w:rPr>
-          <w:rStyle w:val="DataTypeTok"/>
-        </w:rPr>
-        <w:t xml:space="preserve">"subjectAlternativeNameValue"</w:t>
-      </w:r>
-      <w:r>
-        <w:rPr>
-          <w:rStyle w:val="FunctionTok"/>
-        </w:rPr>
-        <w:t xml:space="preserve">:</w:t>
-      </w:r>
-      <w:r>
-        <w:rPr>
-          <w:rStyle w:val="NormalTok"/>
-        </w:rPr>
-        <w:t xml:space="preserve"> </w:t>
-      </w:r>
-      <w:r>
-        <w:rPr>
-          <w:rStyle w:val="StringTok"/>
-        </w:rPr>
-        <w:t xml:space="preserve">"{{DeviceId}}@ssagov.onmicrosoft.com"</w:t>
-      </w:r>
-      <w:r>
-        <w:rPr>
-          <w:rStyle w:val="FunctionTok"/>
-        </w:rPr>
-        <w:t xml:space="preserve">,</w:t>
-      </w:r>
-      <w:r>
-        <w:br/>
-      </w:r>
-      <w:r>
-        <w:rPr>
-          <w:rStyle w:val="NormalTok"/>
-        </w:rPr>
-        <w:t xml:space="preserve">  </w:t>
-      </w:r>
-      <w:r>
-        <w:rPr>
-          <w:rStyle w:val="DataTypeTok"/>
-        </w:rPr>
-        <w:t xml:space="preserve">"certificateValidityPeriodValue"</w:t>
-      </w:r>
-      <w:r>
-        <w:rPr>
-          <w:rStyle w:val="FunctionTok"/>
-        </w:rPr>
-        <w:t xml:space="preserve">:</w:t>
-      </w:r>
-      <w:r>
-        <w:rPr>
-          <w:rStyle w:val="NormalTok"/>
-        </w:rPr>
-        <w:t xml:space="preserve"> </w:t>
-      </w:r>
-      <w:r>
-        <w:rPr>
-          <w:rStyle w:val="DecValTok"/>
-        </w:rPr>
-        <w:t xml:space="preserve">1</w:t>
-      </w:r>
-      <w:r>
-        <w:rPr>
-          <w:rStyle w:val="FunctionTok"/>
-        </w:rPr>
-        <w:t xml:space="preserve">,</w:t>
-      </w:r>
-      <w:r>
-        <w:br/>
-      </w:r>
-      <w:r>
-        <w:rPr>
-          <w:rStyle w:val="NormalTok"/>
-        </w:rPr>
-        <w:t xml:space="preserve">  </w:t>
-      </w:r>
-      <w:r>
-        <w:rPr>
-          <w:rStyle w:val="DataTypeTok"/>
-        </w:rPr>
-        <w:t xml:space="preserve">"certificateValidityPeriodScale"</w:t>
-      </w:r>
-      <w:r>
-        <w:rPr>
-          <w:rStyle w:val="FunctionTok"/>
-        </w:rPr>
-        <w:t xml:space="preserve">:</w:t>
-      </w:r>
-      <w:r>
-        <w:rPr>
-          <w:rStyle w:val="NormalTok"/>
-        </w:rPr>
-        <w:t xml:space="preserve"> </w:t>
-      </w:r>
-      <w:r>
-        <w:rPr>
-          <w:rStyle w:val="StringTok"/>
-        </w:rPr>
-        <w:t xml:space="preserve">"Years"</w:t>
-      </w:r>
-      <w:r>
-        <w:rPr>
-          <w:rStyle w:val="FunctionTok"/>
-        </w:rPr>
-        <w:t xml:space="preserve">,</w:t>
-      </w:r>
-      <w:r>
-        <w:br/>
-      </w:r>
-      <w:r>
-        <w:rPr>
-          <w:rStyle w:val="NormalTok"/>
-        </w:rPr>
-        <w:t xml:space="preserve">  </w:t>
-      </w:r>
-      <w:r>
-        <w:rPr>
-          <w:rStyle w:val="DataTypeTok"/>
-        </w:rPr>
-        <w:t xml:space="preserve">"renewalThresholdPercentage"</w:t>
-      </w:r>
-      <w:r>
-        <w:rPr>
-          <w:rStyle w:val="FunctionTok"/>
-        </w:rPr>
-        <w:t xml:space="preserve">:</w:t>
-      </w:r>
-      <w:r>
-        <w:rPr>
-          <w:rStyle w:val="NormalTok"/>
-        </w:rPr>
-        <w:t xml:space="preserve"> </w:t>
-      </w:r>
-      <w:r>
-        <w:rPr>
-          <w:rStyle w:val="DecValTok"/>
-        </w:rPr>
-        <w:t xml:space="preserve">20</w:t>
-      </w:r>
-      <w:r>
-        <w:rPr>
-          <w:rStyle w:val="FunctionTok"/>
-        </w:rPr>
-        <w:t xml:space="preserve">,</w:t>
-      </w:r>
-      <w:r>
-        <w:br/>
-      </w:r>
-      <w:r>
-        <w:rPr>
-          <w:rStyle w:val="NormalTok"/>
-        </w:rPr>
-        <w:t xml:space="preserve">  </w:t>
-      </w:r>
-      <w:r>
-        <w:rPr>
-          <w:rStyle w:val="DataTypeTok"/>
-        </w:rPr>
-        <w:t xml:space="preserve">"keyStorageProvider"</w:t>
-      </w:r>
-      <w:r>
-        <w:rPr>
-          <w:rStyle w:val="FunctionTok"/>
-        </w:rPr>
-        <w:t xml:space="preserve">:</w:t>
-      </w:r>
-      <w:r>
-        <w:rPr>
-          <w:rStyle w:val="NormalTok"/>
-        </w:rPr>
-        <w:t xml:space="preserve"> </w:t>
-      </w:r>
-      <w:r>
-        <w:rPr>
-          <w:rStyle w:val="StringTok"/>
-        </w:rPr>
-        <w:t xml:space="preserve">"Enroll to TPM KSP if present, otherwise Software KSP"</w:t>
-      </w:r>
-      <w:r>
-        <w:rPr>
-          <w:rStyle w:val="FunctionTok"/>
-        </w:rPr>
-        <w:t xml:space="preserve">,</w:t>
-      </w:r>
-      <w:r>
-        <w:br/>
-      </w:r>
-      <w:r>
-        <w:rPr>
-          <w:rStyle w:val="NormalTok"/>
-        </w:rPr>
-        <w:t xml:space="preserve">  </w:t>
-      </w:r>
-      <w:r>
-        <w:rPr>
-          <w:rStyle w:val="DataTypeTok"/>
-        </w:rPr>
-        <w:t xml:space="preserve">"scepServerUrls"</w:t>
-      </w:r>
-      <w:r>
-        <w:rPr>
-          <w:rStyle w:val="FunctionTok"/>
-        </w:rPr>
-        <w:t xml:space="preserve">:</w:t>
-      </w:r>
-      <w:r>
-        <w:rPr>
-          <w:rStyle w:val="NormalTok"/>
-        </w:rPr>
-        <w:t xml:space="preserve"> </w:t>
-      </w:r>
-      <w:r>
-        <w:rPr>
-          <w:rStyle w:val="OtherTok"/>
-        </w:rPr>
-        <w:t xml:space="preserve">[</w:t>
-      </w:r>
-      <w:r>
-        <w:rPr>
-          <w:rStyle w:val="StringTok"/>
-        </w:rPr>
-        <w:t xml:space="preserve">"https://ndes.ssagov.onmicrosoft.com/certsrv/mscep/mscep.dll"</w:t>
-      </w:r>
-      <w:r>
-        <w:rPr>
-          <w:rStyle w:val="OtherTok"/>
-        </w:rPr>
-        <w:t xml:space="preserve">]</w:t>
-      </w:r>
-      <w:r>
-        <w:br/>
-      </w:r>
-      <w:r>
-        <w:rPr>
-          <w:rStyle w:val="FunctionTok"/>
-        </w:rPr>
-        <w:t xml:space="preserve">}</w:t>
+    <w:bookmarkEnd w:id="35"/>
+    <w:bookmarkStart w:id="48" w:name="X82c6a9b21860f42551bf826059803119df8d347"/>
+    <w:p>
+      <w:pPr>
+        <w:pStyle w:val="Heading1"/>
+      </w:pPr>
+      <w:r>
+        <w:t xml:space="preserve">4. NAC Architecture — RADIUS, 802.1X, and EAP-TLS</w:t>
+      </w:r>
+    </w:p>
+    <w:bookmarkStart w:id="40" w:name="the-authentication-stack"/>
+    <w:p>
+      <w:pPr>
+        <w:pStyle w:val="Heading2"/>
+      </w:pPr>
+      <w:r>
+        <w:t xml:space="preserve">4.1 The Authentication Stack</w:t>
       </w:r>
     </w:p>
     <w:p>
@@ -2810,55 +1335,7 @@
         <w:pStyle w:val="FirstParagraph"/>
       </w:pPr>
       <w:r>
-        <w:t xml:space="preserve">The</w:t>
-      </w:r>
-      <w:r>
-        <w:t xml:space="preserve"> </w:t>
-      </w:r>
-      <w:r>
-        <w:rPr>
-          <w:rStyle w:val="VerbatimChar"/>
-        </w:rPr>
-        <w:t xml:space="preserve">subjectAlternativeNameValue</w:t>
-      </w:r>
-      <w:r>
-        <w:t xml:space="preserve"> </w:t>
-      </w:r>
-      <w:r>
-        <w:t xml:space="preserve">uses</w:t>
-      </w:r>
-      <w:r>
-        <w:t xml:space="preserve"> </w:t>
-      </w:r>
-      <w:r>
-        <w:rPr>
-          <w:rStyle w:val="VerbatimChar"/>
-        </w:rPr>
-        <w:t xml:space="preserve">{DeviceId}</w:t>
-      </w:r>
-      <w:r>
-        <w:t xml:space="preserve"> </w:t>
-      </w:r>
-      <w:r>
-        <w:t xml:space="preserve">— the Intune Device ID. The NPS policy is configured to validate that the SAN in the presented certificate corresponds to an active, compliant device in the Entra ID device inventory via the Graph API. A certificate from a device that has since been wiped, deleted from Entra ID, or marked non-compliant is rejected even if the certificate itself has not expired.</w:t>
-      </w:r>
-    </w:p>
-    <w:bookmarkEnd w:id="42"/>
-    <w:bookmarkStart w:id="43" w:name="certificate-revocation"/>
-    <w:p>
-      <w:pPr>
-        <w:pStyle w:val="Heading2"/>
-      </w:pPr>
-      <w:r>
-        <w:t xml:space="preserve">5.3 Certificate Revocation</w:t>
-      </w:r>
-    </w:p>
-    <w:p>
-      <w:pPr>
-        <w:pStyle w:val="FirstParagraph"/>
-      </w:pPr>
-      <w:r>
-        <w:t xml:space="preserve">Two revocation mechanisms operate in parallel:</w:t>
+        <w:t xml:space="preserve">802.1X Network Access Control is a port-based authentication framework defined in IEEE 802.1X-2020. It introduces three roles to every network admission event:</w:t>
       </w:r>
     </w:p>
     <w:p>
@@ -2866,7 +1343,7 @@
         <w:pStyle w:val="Compact"/>
         <w:numPr>
           <w:ilvl w:val="0"/>
-          <w:numId w:val="1006"/>
+          <w:numId w:val="1002"/>
         </w:numPr>
       </w:pPr>
       <w:r>
@@ -2874,13 +1351,28 @@
           <w:b/>
           <w:bCs/>
         </w:rPr>
-        <w:t xml:space="preserve">CRL (Certificate Revocation List)</w:t>
-      </w:r>
-      <w:r>
-        <w:t xml:space="preserve"> </w:t>
-      </w:r>
-      <w:r>
-        <w:t xml:space="preserve">— the CA publishes a CRL every 24 hours. NPS checks the CRL before accepting a certificate. The CRL distribution point URL must be reachable from all NPS servers (HTTP, not LDAP, for resilience).</w:t>
+        <w:t xml:space="preserve">Supplicant</w:t>
+      </w:r>
+      <w:r>
+        <w:t xml:space="preserve"> </w:t>
+      </w:r>
+      <w:r>
+        <w:t xml:space="preserve">— the software on the device requesting network access. On Windows, this is the built-in 802.1X supplicant configured via Intune policy. On Linux,</w:t>
+      </w:r>
+      <w:r>
+        <w:t xml:space="preserve"> </w:t>
+      </w:r>
+      <w:r>
+        <w:rPr>
+          <w:rStyle w:val="VerbatimChar"/>
+        </w:rPr>
+        <w:t xml:space="preserve">wpa_supplicant</w:t>
+      </w:r>
+      <w:r>
+        <w:t xml:space="preserve"> </w:t>
+      </w:r>
+      <w:r>
+        <w:t xml:space="preserve">is the standard. On macOS, the native supplicant is configured through MDM.</w:t>
       </w:r>
     </w:p>
     <w:p>
@@ -2888,7 +1380,7 @@
         <w:pStyle w:val="Compact"/>
         <w:numPr>
           <w:ilvl w:val="0"/>
-          <w:numId w:val="1006"/>
+          <w:numId w:val="1002"/>
         </w:numPr>
       </w:pPr>
       <w:r>
@@ -2896,13 +1388,35 @@
           <w:b/>
           <w:bCs/>
         </w:rPr>
-        <w:t xml:space="preserve">OCSP (Online Certificate Status Protocol)</w:t>
-      </w:r>
-      <w:r>
-        <w:t xml:space="preserve"> </w:t>
-      </w:r>
-      <w:r>
-        <w:t xml:space="preserve">— for real-time revocation checks. The CA’s OCSP responder answers per-certificate status queries in under 500ms. NPS queries OCSP on every authentication if the CA supports it and the certificate includes an OCSP stapling extension.</w:t>
+        <w:t xml:space="preserve">Authenticator</w:t>
+      </w:r>
+      <w:r>
+        <w:t xml:space="preserve"> </w:t>
+      </w:r>
+      <w:r>
+        <w:t xml:space="preserve">— the network device that enforces access (a managed switch or wireless access point). The authenticator does not validate credentials itself; it relays the EAP exchange between the supplicant and the authentication server and enforces the VLAN assignment returned by the authentication server.</w:t>
+      </w:r>
+    </w:p>
+    <w:p>
+      <w:pPr>
+        <w:pStyle w:val="Compact"/>
+        <w:numPr>
+          <w:ilvl w:val="0"/>
+          <w:numId w:val="1002"/>
+        </w:numPr>
+      </w:pPr>
+      <w:r>
+        <w:rPr>
+          <w:b/>
+          <w:bCs/>
+        </w:rPr>
+        <w:t xml:space="preserve">Authentication Server</w:t>
+      </w:r>
+      <w:r>
+        <w:t xml:space="preserve"> </w:t>
+      </w:r>
+      <w:r>
+        <w:t xml:space="preserve">— the RADIUS server that validates the supplicant’s credentials and returns the access decision (VLAN ID, session timeout, filter rules).</w:t>
       </w:r>
     </w:p>
     <w:p>
@@ -2910,35 +1424,7 @@
         <w:pStyle w:val="FirstParagraph"/>
       </w:pPr>
       <w:r>
-        <w:t xml:space="preserve">When a device is decommissioned, stolen, or wiped, the device certificate is revoked in the CA within the same change window. The next 802.1X re-authentication (which occurs every 8 hours per the NPS policy) will fail the revocation check and move the port to the quarantine VLAN.</w:t>
-      </w:r>
-    </w:p>
-    <w:bookmarkEnd w:id="43"/>
-    <w:bookmarkEnd w:id="44"/>
-    <w:bookmarkStart w:id="56" w:name="nac-policy-tier-structure"/>
-    <w:p>
-      <w:pPr>
-        <w:pStyle w:val="Heading1"/>
-      </w:pPr>
-      <w:r>
-        <w:t xml:space="preserve">6. NAC Policy Tier Structure</w:t>
-      </w:r>
-    </w:p>
-    <w:bookmarkStart w:id="49" w:name="overview"/>
-    <w:p>
-      <w:pPr>
-        <w:pStyle w:val="Heading2"/>
-      </w:pPr>
-      <w:r>
-        <w:t xml:space="preserve">6.1 Overview</w:t>
-      </w:r>
-    </w:p>
-    <w:p>
-      <w:pPr>
-        <w:pStyle w:val="FirstParagraph"/>
-      </w:pPr>
-      <w:r>
-        <w:t xml:space="preserve">The RADIUS server returns a VLAN assignment (and optionally a filter policy and session timeout) for each authenticated device. The VLAN assignment is the enforcement mechanism — it determines which network segment the device enters and therefore which resources it can reach.</w:t>
+        <w:t xml:space="preserve">The exchange protocol between supplicant and authentication server is the Extensible Authentication Protocol (EAP), carried over RADIUS between the authenticator and the authentication server.</w:t>
       </w:r>
     </w:p>
     <w:tbl>
@@ -2954,7 +1440,7 @@
       <w:tr>
         <w:tc>
           <w:tcPr/>
-          <w:bookmarkStart w:id="48" w:name="fig-nac04"/>
+          <w:bookmarkStart w:id="39" w:name="fig-nac09"/>
           <w:p>
             <w:pPr>
               <w:pStyle w:val="Compact"/>
@@ -2965,18 +1451,18 @@
                 <wp:inline>
                   <wp:extent cx="5334000" cy="3000375"/>
                   <wp:effectExtent b="0" l="0" r="0" t="0"/>
-                  <wp:docPr descr="" title="" id="46" name="Picture"/>
+                  <wp:docPr descr="" title="" id="37" name="Picture"/>
                   <a:graphic>
                     <a:graphicData uri="http://schemas.openxmlformats.org/drawingml/2006/picture">
                       <pic:pic>
                         <pic:nvPicPr>
-                          <pic:cNvPr descr="figs/nac-fig-04-policy-tiers.png" id="47" name="Picture"/>
+                          <pic:cNvPr descr="figs/nac-fig-09-authentication-stack.png" id="38" name="Picture"/>
                           <pic:cNvPicPr>
                             <a:picLocks noChangeArrowheads="1" noChangeAspect="1"/>
                           </pic:cNvPicPr>
                         </pic:nvPicPr>
                         <pic:blipFill>
-                          <a:blip r:embed="rId45"/>
+                          <a:blip r:embed="rId36"/>
                           <a:stretch>
                             <a:fillRect/>
                           </a:stretch>
@@ -3013,10 +1499,1782 @@
               <w:pStyle w:val="ImageCaption"/>
             </w:pPr>
             <w:r>
-              <w:t xml:space="preserve">Figure 4: NAC policy tier diagram showing three VLANs and the policy path from 802.1X authentication through RADIUS compliance check to VLAN assignment</w:t>
-            </w:r>
-          </w:p>
-          <w:bookmarkEnd w:id="48"/>
+              <w:t xml:space="preserve">Figure 4: The 802.1X authentication stack — supplicant, authenticator, authentication server</w:t>
+            </w:r>
+          </w:p>
+          <w:bookmarkEnd w:id="39"/>
+        </w:tc>
+      </w:tr>
+    </w:tbl>
+    <w:bookmarkEnd w:id="40"/>
+    <w:bookmarkStart w:id="41" w:name="Xe6727c90454fe28f5c795c7f2710efc24477f82"/>
+    <w:p>
+      <w:pPr>
+        <w:pStyle w:val="Heading2"/>
+      </w:pPr>
+      <w:r>
+        <w:t xml:space="preserve">4.2 EAP Method Selection — Why EAP-TLS for Federal</w:t>
+      </w:r>
+    </w:p>
+    <w:p>
+      <w:pPr>
+        <w:pStyle w:val="FirstParagraph"/>
+      </w:pPr>
+      <w:r>
+        <w:t xml:space="preserve">NIST SP 800-120 (Recommendation for EAP Methods Used in Wireless Network Access Authentication) and NIST SP 800-153 (Guidelines for Securing Wireless Local Area Networks) both recommend EAP-TLS as the strongest EAP method for federal environments. The choice is not optional under FedRAMP Moderate:</w:t>
+      </w:r>
+    </w:p>
+    <w:p>
+      <w:pPr>
+        <w:pStyle w:val="TableCaption"/>
+      </w:pPr>
+      <w:r>
+        <w:t xml:space="preserve">EAP Method Comparison for Federal NAC</w:t>
+      </w:r>
+    </w:p>
+    <w:tbl>
+      <w:tblPr>
+        <w:tblStyle w:val="Table"/>
+        <w:tblW w:type="pct" w:w="5000"/>
+        <w:tblLayout w:type="fixed"/>
+        <w:tblLook w:firstRow="1" w:lastRow="0" w:firstColumn="0" w:lastColumn="0" w:noHBand="0" w:noVBand="0" w:val="0020"/>
+        <w:tblCaption w:val="EAP Method Comparison for Federal NAC"/>
+      </w:tblPr>
+      <w:tblGrid>
+        <w:gridCol w:w="979"/>
+        <w:gridCol w:w="898"/>
+        <w:gridCol w:w="1551"/>
+        <w:gridCol w:w="1551"/>
+        <w:gridCol w:w="1224"/>
+        <w:gridCol w:w="1714"/>
+      </w:tblGrid>
+      <w:tr>
+        <w:trPr>
+          <w:tblHeader w:val="on"/>
+        </w:trPr>
+        <w:tc>
+          <w:tcPr/>
+          <w:p>
+            <w:pPr>
+              <w:pStyle w:val="Compact"/>
+            </w:pPr>
+            <w:r>
+              <w:t xml:space="preserve">EAP Method</w:t>
+            </w:r>
+          </w:p>
+        </w:tc>
+        <w:tc>
+          <w:tcPr/>
+          <w:p>
+            <w:pPr>
+              <w:pStyle w:val="Compact"/>
+            </w:pPr>
+            <w:r>
+              <w:t xml:space="preserve">Credential</w:t>
+            </w:r>
+          </w:p>
+        </w:tc>
+        <w:tc>
+          <w:tcPr/>
+          <w:p>
+            <w:pPr>
+              <w:pStyle w:val="Compact"/>
+            </w:pPr>
+            <w:r>
+              <w:t xml:space="preserve">Server Certificate</w:t>
+            </w:r>
+          </w:p>
+        </w:tc>
+        <w:tc>
+          <w:tcPr/>
+          <w:p>
+            <w:pPr>
+              <w:pStyle w:val="Compact"/>
+            </w:pPr>
+            <w:r>
+              <w:t xml:space="preserve">Client Certificate</w:t>
+            </w:r>
+          </w:p>
+        </w:tc>
+        <w:tc>
+          <w:tcPr/>
+          <w:p>
+            <w:pPr>
+              <w:pStyle w:val="Compact"/>
+            </w:pPr>
+            <w:r>
+              <w:t xml:space="preserve">FIPS Approved</w:t>
+            </w:r>
+          </w:p>
+        </w:tc>
+        <w:tc>
+          <w:tcPr/>
+          <w:p>
+            <w:pPr>
+              <w:pStyle w:val="Compact"/>
+            </w:pPr>
+            <w:r>
+              <w:t xml:space="preserve">Federal Suitability</w:t>
+            </w:r>
+          </w:p>
+        </w:tc>
+      </w:tr>
+      <w:tr>
+        <w:tc>
+          <w:tcPr/>
+          <w:p>
+            <w:pPr>
+              <w:pStyle w:val="Compact"/>
+            </w:pPr>
+            <w:r>
+              <w:t xml:space="preserve">EAP-PEAP/MSCHAPv2</w:t>
+            </w:r>
+          </w:p>
+        </w:tc>
+        <w:tc>
+          <w:tcPr/>
+          <w:p>
+            <w:pPr>
+              <w:pStyle w:val="Compact"/>
+            </w:pPr>
+            <w:r>
+              <w:t xml:space="preserve">Password</w:t>
+            </w:r>
+          </w:p>
+        </w:tc>
+        <w:tc>
+          <w:tcPr/>
+          <w:p>
+            <w:pPr>
+              <w:pStyle w:val="Compact"/>
+            </w:pPr>
+            <w:r>
+              <w:t xml:space="preserve">Required</w:t>
+            </w:r>
+          </w:p>
+        </w:tc>
+        <w:tc>
+          <w:tcPr/>
+          <w:p>
+            <w:pPr>
+              <w:pStyle w:val="Compact"/>
+            </w:pPr>
+            <w:r>
+              <w:t xml:space="preserve">Not required</w:t>
+            </w:r>
+          </w:p>
+        </w:tc>
+        <w:tc>
+          <w:tcPr/>
+          <w:p>
+            <w:pPr>
+              <w:pStyle w:val="Compact"/>
+            </w:pPr>
+            <w:r>
+              <w:t xml:space="preserve">No (MSCHAPv2)</w:t>
+            </w:r>
+          </w:p>
+        </w:tc>
+        <w:tc>
+          <w:tcPr/>
+          <w:p>
+            <w:pPr>
+              <w:pStyle w:val="Compact"/>
+            </w:pPr>
+            <w:r>
+              <w:t xml:space="preserve">Not acceptable — NTLM derivative</w:t>
+            </w:r>
+          </w:p>
+        </w:tc>
+      </w:tr>
+      <w:tr>
+        <w:tc>
+          <w:tcPr/>
+          <w:p>
+            <w:pPr>
+              <w:pStyle w:val="Compact"/>
+            </w:pPr>
+            <w:r>
+              <w:t xml:space="preserve">EAP-TTLS/PAP</w:t>
+            </w:r>
+          </w:p>
+        </w:tc>
+        <w:tc>
+          <w:tcPr/>
+          <w:p>
+            <w:pPr>
+              <w:pStyle w:val="Compact"/>
+            </w:pPr>
+            <w:r>
+              <w:t xml:space="preserve">Password</w:t>
+            </w:r>
+          </w:p>
+        </w:tc>
+        <w:tc>
+          <w:tcPr/>
+          <w:p>
+            <w:pPr>
+              <w:pStyle w:val="Compact"/>
+            </w:pPr>
+            <w:r>
+              <w:t xml:space="preserve">Required</w:t>
+            </w:r>
+          </w:p>
+        </w:tc>
+        <w:tc>
+          <w:tcPr/>
+          <w:p>
+            <w:pPr>
+              <w:pStyle w:val="Compact"/>
+            </w:pPr>
+            <w:r>
+              <w:t xml:space="preserve">Not required</w:t>
+            </w:r>
+          </w:p>
+        </w:tc>
+        <w:tc>
+          <w:tcPr/>
+          <w:p>
+            <w:pPr>
+              <w:pStyle w:val="Compact"/>
+            </w:pPr>
+            <w:r>
+              <w:t xml:space="preserve">No</w:t>
+            </w:r>
+          </w:p>
+        </w:tc>
+        <w:tc>
+          <w:tcPr/>
+          <w:p>
+            <w:pPr>
+              <w:pStyle w:val="Compact"/>
+            </w:pPr>
+            <w:r>
+              <w:t xml:space="preserve">Not acceptable — plaintext credential in tunnel</w:t>
+            </w:r>
+          </w:p>
+        </w:tc>
+      </w:tr>
+      <w:tr>
+        <w:tc>
+          <w:tcPr/>
+          <w:p>
+            <w:pPr>
+              <w:pStyle w:val="Compact"/>
+            </w:pPr>
+            <w:r>
+              <w:t xml:space="preserve">EAP-PEAP/EAP-TLS</w:t>
+            </w:r>
+          </w:p>
+        </w:tc>
+        <w:tc>
+          <w:tcPr/>
+          <w:p>
+            <w:pPr>
+              <w:pStyle w:val="Compact"/>
+            </w:pPr>
+            <w:r>
+              <w:t xml:space="preserve">Certificate</w:t>
+            </w:r>
+          </w:p>
+        </w:tc>
+        <w:tc>
+          <w:tcPr/>
+          <w:p>
+            <w:pPr>
+              <w:pStyle w:val="Compact"/>
+            </w:pPr>
+            <w:r>
+              <w:t xml:space="preserve">Required</w:t>
+            </w:r>
+          </w:p>
+        </w:tc>
+        <w:tc>
+          <w:tcPr/>
+          <w:p>
+            <w:pPr>
+              <w:pStyle w:val="Compact"/>
+            </w:pPr>
+            <w:r>
+              <w:t xml:space="preserve">Required</w:t>
+            </w:r>
+          </w:p>
+        </w:tc>
+        <w:tc>
+          <w:tcPr/>
+          <w:p>
+            <w:pPr>
+              <w:pStyle w:val="Compact"/>
+            </w:pPr>
+            <w:r>
+              <w:t xml:space="preserve">Yes</w:t>
+            </w:r>
+          </w:p>
+        </w:tc>
+        <w:tc>
+          <w:tcPr/>
+          <w:p>
+            <w:pPr>
+              <w:pStyle w:val="Compact"/>
+            </w:pPr>
+            <w:r>
+              <w:t xml:space="preserve">Acceptable — but EAP-TLS alone is simpler</w:t>
+            </w:r>
+          </w:p>
+        </w:tc>
+      </w:tr>
+      <w:tr>
+        <w:tc>
+          <w:tcPr/>
+          <w:p>
+            <w:pPr>
+              <w:pStyle w:val="Compact"/>
+            </w:pPr>
+            <w:r>
+              <w:rPr>
+                <w:b/>
+                <w:bCs/>
+              </w:rPr>
+              <w:t xml:space="preserve">EAP-TLS</w:t>
+            </w:r>
+          </w:p>
+        </w:tc>
+        <w:tc>
+          <w:tcPr/>
+          <w:p>
+            <w:pPr>
+              <w:pStyle w:val="Compact"/>
+            </w:pPr>
+            <w:r>
+              <w:rPr>
+                <w:b/>
+                <w:bCs/>
+              </w:rPr>
+              <w:t xml:space="preserve">Certificate</w:t>
+            </w:r>
+          </w:p>
+        </w:tc>
+        <w:tc>
+          <w:tcPr/>
+          <w:p>
+            <w:pPr>
+              <w:pStyle w:val="Compact"/>
+            </w:pPr>
+            <w:r>
+              <w:rPr>
+                <w:b/>
+                <w:bCs/>
+              </w:rPr>
+              <w:t xml:space="preserve">Required</w:t>
+            </w:r>
+          </w:p>
+        </w:tc>
+        <w:tc>
+          <w:tcPr/>
+          <w:p>
+            <w:pPr>
+              <w:pStyle w:val="Compact"/>
+            </w:pPr>
+            <w:r>
+              <w:rPr>
+                <w:b/>
+                <w:bCs/>
+              </w:rPr>
+              <w:t xml:space="preserve">Required</w:t>
+            </w:r>
+          </w:p>
+        </w:tc>
+        <w:tc>
+          <w:tcPr/>
+          <w:p>
+            <w:pPr>
+              <w:pStyle w:val="Compact"/>
+            </w:pPr>
+            <w:r>
+              <w:rPr>
+                <w:b/>
+                <w:bCs/>
+              </w:rPr>
+              <w:t xml:space="preserve">Yes</w:t>
+            </w:r>
+          </w:p>
+        </w:tc>
+        <w:tc>
+          <w:tcPr/>
+          <w:p>
+            <w:pPr>
+              <w:pStyle w:val="Compact"/>
+            </w:pPr>
+            <w:r>
+              <w:rPr>
+                <w:b/>
+                <w:bCs/>
+              </w:rPr>
+              <w:t xml:space="preserve">Recommended — mutual certificate authentication</w:t>
+            </w:r>
+          </w:p>
+        </w:tc>
+      </w:tr>
+    </w:tbl>
+    <w:p>
+      <w:pPr>
+        <w:pStyle w:val="BodyText"/>
+      </w:pPr>
+      <w:r>
+        <w:t xml:space="preserve">EAP-TLS provides mutual authentication: the RADIUS server presents its certificate to the supplicant (server identity), and the supplicant presents its machine certificate to the RADIUS server (device identity). Both assertions are cryptographically verified. Neither side can be impersonated without access to the private key of the relevant certificate authority.</w:t>
+      </w:r>
+    </w:p>
+    <w:p>
+      <w:pPr>
+        <w:pStyle w:val="BodyText"/>
+      </w:pPr>
+      <w:r>
+        <w:t xml:space="preserve">This matters structurally: EAP-PEAP/MSCHAPv2, used in many legacy federal wireless deployments, is vulnerable to offline dictionary attacks against captured handshakes and rogue AP attacks (a malicious AP presents a self-signed server certificate that the supplicant accepts due to misconfigured validation). EAP-TLS with strict CA pinning eliminates both attack classes.</w:t>
+      </w:r>
+    </w:p>
+    <w:bookmarkEnd w:id="41"/>
+    <w:bookmarkStart w:id="46" w:name="X3de18886d568cb768549bf58e9356d28128105d"/>
+    <w:p>
+      <w:pPr>
+        <w:pStyle w:val="Heading2"/>
+      </w:pPr>
+      <w:r>
+        <w:t xml:space="preserve">4.3 RADIUS Server Design for Federal Environments</w:t>
+      </w:r>
+    </w:p>
+    <w:p>
+      <w:pPr>
+        <w:pStyle w:val="FirstParagraph"/>
+      </w:pPr>
+      <w:r>
+        <w:t xml:space="preserve">The RADIUS server is the authentication server in the 802.1X architecture. For SSA GCC Moderate, the recommended RADIUS implementation is</w:t>
+      </w:r>
+      <w:r>
+        <w:t xml:space="preserve"> </w:t>
+      </w:r>
+      <w:r>
+        <w:rPr>
+          <w:b/>
+          <w:bCs/>
+        </w:rPr>
+        <w:t xml:space="preserve">Microsoft Network Policy Server (NPS)</w:t>
+      </w:r>
+      <w:r>
+        <w:t xml:space="preserve"> </w:t>
+      </w:r>
+      <w:r>
+        <w:t xml:space="preserve">deployed on Windows Server 2025 in a highly available configuration, integrated with Entra ID via</w:t>
+      </w:r>
+      <w:r>
+        <w:t xml:space="preserve"> </w:t>
+      </w:r>
+      <w:r>
+        <w:rPr>
+          <w:b/>
+          <w:bCs/>
+        </w:rPr>
+        <w:t xml:space="preserve">Entra ID Certificate Authority</w:t>
+      </w:r>
+      <w:r>
+        <w:t xml:space="preserve"> </w:t>
+      </w:r>
+      <w:r>
+        <w:t xml:space="preserve">for cloud-issued device certificates.</w:t>
+      </w:r>
+    </w:p>
+    <w:p>
+      <w:pPr>
+        <w:pStyle w:val="BodyText"/>
+      </w:pPr>
+      <w:r>
+        <w:t xml:space="preserve">For agencies with existing infrastructure investment,</w:t>
+      </w:r>
+      <w:r>
+        <w:t xml:space="preserve"> </w:t>
+      </w:r>
+      <w:r>
+        <w:rPr>
+          <w:b/>
+          <w:bCs/>
+        </w:rPr>
+        <w:t xml:space="preserve">Cisco Identity Services Engine (ISE)</w:t>
+      </w:r>
+      <w:r>
+        <w:t xml:space="preserve"> </w:t>
+      </w:r>
+      <w:r>
+        <w:t xml:space="preserve">and</w:t>
+      </w:r>
+      <w:r>
+        <w:t xml:space="preserve"> </w:t>
+      </w:r>
+      <w:r>
+        <w:rPr>
+          <w:b/>
+          <w:bCs/>
+        </w:rPr>
+        <w:t xml:space="preserve">Aruba ClearPass</w:t>
+      </w:r>
+      <w:r>
+        <w:t xml:space="preserve"> </w:t>
+      </w:r>
+      <w:r>
+        <w:t xml:space="preserve">are the dominant federal alternatives; both support the same EAP-TLS + Entra integration described in this document.</w:t>
+      </w:r>
+    </w:p>
+    <w:tbl>
+      <w:tblPr>
+        <w:tblStyle w:val="Table"/>
+        <w:tblW w:type="pct" w:w="5000"/>
+        <w:tblLayout w:type="fixed"/>
+        <w:tblLook w:firstRow="0" w:lastRow="0" w:firstColumn="0" w:lastColumn="0" w:noHBand="0" w:noVBand="0" w:val="0000"/>
+      </w:tblPr>
+      <w:tblGrid>
+        <w:gridCol w:w="7920"/>
+      </w:tblGrid>
+      <w:tr>
+        <w:tc>
+          <w:tcPr/>
+          <w:bookmarkStart w:id="45" w:name="fig-nac02"/>
+          <w:p>
+            <w:pPr>
+              <w:pStyle w:val="Compact"/>
+              <w:jc w:val="center"/>
+            </w:pPr>
+            <w:r>
+              <w:drawing>
+                <wp:inline>
+                  <wp:extent cx="5334000" cy="3000375"/>
+                  <wp:effectExtent b="0" l="0" r="0" t="0"/>
+                  <wp:docPr descr="" title="" id="43" name="Picture"/>
+                  <a:graphic>
+                    <a:graphicData uri="http://schemas.openxmlformats.org/drawingml/2006/picture">
+                      <pic:pic>
+                        <pic:nvPicPr>
+                          <pic:cNvPr descr="figs/nac-fig-02-radius-architecture.png" id="44" name="Picture"/>
+                          <pic:cNvPicPr>
+                            <a:picLocks noChangeArrowheads="1" noChangeAspect="1"/>
+                          </pic:cNvPicPr>
+                        </pic:nvPicPr>
+                        <pic:blipFill>
+                          <a:blip r:embed="rId42"/>
+                          <a:stretch>
+                            <a:fillRect/>
+                          </a:stretch>
+                        </pic:blipFill>
+                        <pic:spPr bwMode="auto">
+                          <a:xfrm>
+                            <a:off x="0" y="0"/>
+                            <a:ext cx="5334000" cy="3000375"/>
+                          </a:xfrm>
+                          <a:prstGeom prst="rect">
+                            <a:avLst/>
+                          </a:prstGeom>
+                          <a:noFill/>
+                          <a:ln w="9525">
+                            <a:noFill/>
+                            <a:headEnd/>
+                            <a:tailEnd/>
+                          </a:ln>
+                        </pic:spPr>
+                      </pic:pic>
+                    </a:graphicData>
+                  </a:graphic>
+                </wp:inline>
+              </w:drawing>
+            </w:r>
+          </w:p>
+          <w:p>
+            <w:pPr>
+              <w:jc w:val="center"/>
+            </w:pPr>
+            <w:pPr>
+              <w:jc w:val="left"/>
+              <w:spacing w:before="200"/>
+              <w:pStyle w:val="ImageCaption"/>
+            </w:pPr>
+            <w:r>
+              <w:t xml:space="preserve">Figure 5: RADIUS server architecture showing NPS in high-availability configuration with primary and secondary servers, RADIUS proxy groups for wired and wireless authenticators, and integration with Entra ID Certificate Authority and Intune Compliance API</w:t>
+            </w:r>
+          </w:p>
+          <w:bookmarkEnd w:id="45"/>
+        </w:tc>
+      </w:tr>
+    </w:tbl>
+    <w:p>
+      <w:pPr>
+        <w:pStyle w:val="BodyText"/>
+      </w:pPr>
+      <w:r>
+        <w:rPr>
+          <w:b/>
+          <w:bCs/>
+        </w:rPr>
+        <w:t xml:space="preserve">NPS High Availability</w:t>
+      </w:r>
+      <w:r>
+        <w:t xml:space="preserve"> </w:t>
+      </w:r>
+      <w:r>
+        <w:t xml:space="preserve">— NPS does not natively replicate configuration between nodes. The standard approach for federal environments is:</w:t>
+      </w:r>
+    </w:p>
+    <w:p>
+      <w:pPr>
+        <w:pStyle w:val="Compact"/>
+        <w:numPr>
+          <w:ilvl w:val="0"/>
+          <w:numId w:val="1003"/>
+        </w:numPr>
+      </w:pPr>
+      <w:r>
+        <w:t xml:space="preserve">Deploy two NPS servers in the same region.</w:t>
+      </w:r>
+    </w:p>
+    <w:p>
+      <w:pPr>
+        <w:pStyle w:val="Compact"/>
+        <w:numPr>
+          <w:ilvl w:val="0"/>
+          <w:numId w:val="1003"/>
+        </w:numPr>
+      </w:pPr>
+      <w:r>
+        <w:t xml:space="preserve">Configure all RADIUS clients (switches, WAPs) with both servers, primary and secondary, with a 3-second failover timeout.</w:t>
+      </w:r>
+    </w:p>
+    <w:p>
+      <w:pPr>
+        <w:pStyle w:val="Compact"/>
+        <w:numPr>
+          <w:ilvl w:val="0"/>
+          <w:numId w:val="1003"/>
+        </w:numPr>
+      </w:pPr>
+      <w:r>
+        <w:t xml:space="preserve">Use a shared NPS configuration export/import script (or Group Policy) to keep policy synchronized.</w:t>
+      </w:r>
+    </w:p>
+    <w:p>
+      <w:pPr>
+        <w:pStyle w:val="Compact"/>
+        <w:numPr>
+          <w:ilvl w:val="0"/>
+          <w:numId w:val="1003"/>
+        </w:numPr>
+      </w:pPr>
+      <w:r>
+        <w:t xml:space="preserve">Monitor NPS availability with a Sentinel heartbeat alert (absence of RADIUS accounting events for &gt; 5 minutes from a production authenticator triggers a P2 alert).</w:t>
+      </w:r>
+    </w:p>
+    <w:p>
+      <w:pPr>
+        <w:pStyle w:val="FirstParagraph"/>
+      </w:pPr>
+      <w:r>
+        <w:rPr>
+          <w:b/>
+          <w:bCs/>
+        </w:rPr>
+        <w:t xml:space="preserve">RADIUS Shared Secrets</w:t>
+      </w:r>
+      <w:r>
+        <w:t xml:space="preserve"> </w:t>
+      </w:r>
+      <w:r>
+        <w:t xml:space="preserve">— Each authenticator (switch, WAP) requires a shared secret with the RADIUS server. For federal environments:</w:t>
+      </w:r>
+    </w:p>
+    <w:p>
+      <w:pPr>
+        <w:pStyle w:val="Compact"/>
+        <w:numPr>
+          <w:ilvl w:val="0"/>
+          <w:numId w:val="1004"/>
+        </w:numPr>
+      </w:pPr>
+      <w:r>
+        <w:t xml:space="preserve">Generate secrets with 32+ characters of cryptographic randomness.</w:t>
+      </w:r>
+    </w:p>
+    <w:p>
+      <w:pPr>
+        <w:pStyle w:val="Compact"/>
+        <w:numPr>
+          <w:ilvl w:val="0"/>
+          <w:numId w:val="1004"/>
+        </w:numPr>
+      </w:pPr>
+      <w:r>
+        <w:t xml:space="preserve">Store secrets in Azure Key Vault and rotate on a 180-day schedule.</w:t>
+      </w:r>
+    </w:p>
+    <w:p>
+      <w:pPr>
+        <w:pStyle w:val="Compact"/>
+        <w:numPr>
+          <w:ilvl w:val="0"/>
+          <w:numId w:val="1004"/>
+        </w:numPr>
+      </w:pPr>
+      <w:r>
+        <w:t xml:space="preserve">Use RADIUS over TLS (RadSec, RFC 6614) where the switch/WAP firmware supports it — this replaces the shared secret model with mutual TLS between authenticator and authentication server, eliminating the weakest link in the RADIUS trust chain.</w:t>
+      </w:r>
+    </w:p>
+    <w:bookmarkEnd w:id="46"/>
+    <w:bookmarkStart w:id="47" w:name="x-port-configuration"/>
+    <w:p>
+      <w:pPr>
+        <w:pStyle w:val="Heading2"/>
+      </w:pPr>
+      <w:r>
+        <w:t xml:space="preserve">4.4 802.1X Port Configuration</w:t>
+      </w:r>
+    </w:p>
+    <w:p>
+      <w:pPr>
+        <w:pStyle w:val="FirstParagraph"/>
+      </w:pPr>
+      <w:r>
+        <w:t xml:space="preserve">Every managed switch port that faces an end-device (not an uplink or trunk) is configured for 802.1X authentication. The configuration specifies three possible outcomes:</w:t>
+      </w:r>
+    </w:p>
+    <w:p>
+      <w:pPr>
+        <w:pStyle w:val="SourceCode"/>
+      </w:pPr>
+      <w:r>
+        <w:rPr>
+          <w:rStyle w:val="VerbatimChar"/>
+        </w:rPr>
+        <w:t xml:space="preserve"># Cisco IOS-XE example — port facing endpoint</w:t>
+      </w:r>
+      <w:r>
+        <w:br/>
+      </w:r>
+      <w:r>
+        <w:rPr>
+          <w:rStyle w:val="VerbatimChar"/>
+        </w:rPr>
+        <w:t xml:space="preserve">interface GigabitEthernet1/0/1</w:t>
+      </w:r>
+      <w:r>
+        <w:br/>
+      </w:r>
+      <w:r>
+        <w:rPr>
+          <w:rStyle w:val="VerbatimChar"/>
+        </w:rPr>
+        <w:t xml:space="preserve"> switchport mode access</w:t>
+      </w:r>
+      <w:r>
+        <w:br/>
+      </w:r>
+      <w:r>
+        <w:rPr>
+          <w:rStyle w:val="VerbatimChar"/>
+        </w:rPr>
+        <w:t xml:space="preserve"> switchport access vlan 10          ! fallback only -- 802.1X overrides</w:t>
+      </w:r>
+      <w:r>
+        <w:br/>
+      </w:r>
+      <w:r>
+        <w:rPr>
+          <w:rStyle w:val="VerbatimChar"/>
+        </w:rPr>
+        <w:t xml:space="preserve"> authentication port-control auto   ! enable 802.1X</w:t>
+      </w:r>
+      <w:r>
+        <w:br/>
+      </w:r>
+      <w:r>
+        <w:rPr>
+          <w:rStyle w:val="VerbatimChar"/>
+        </w:rPr>
+        <w:t xml:space="preserve"> authentication host-mode multi-auth! allow phone + PC on same port</w:t>
+      </w:r>
+      <w:r>
+        <w:br/>
+      </w:r>
+      <w:r>
+        <w:rPr>
+          <w:rStyle w:val="VerbatimChar"/>
+        </w:rPr>
+        <w:t xml:space="preserve"> authentication order dot1x mab     ! try 802.1X first, then MAB</w:t>
+      </w:r>
+      <w:r>
+        <w:br/>
+      </w:r>
+      <w:r>
+        <w:rPr>
+          <w:rStyle w:val="VerbatimChar"/>
+        </w:rPr>
+        <w:t xml:space="preserve"> authentication priority dot1x mab  ! 802.1X always wins if both present</w:t>
+      </w:r>
+      <w:r>
+        <w:br/>
+      </w:r>
+      <w:r>
+        <w:rPr>
+          <w:rStyle w:val="VerbatimChar"/>
+        </w:rPr>
+        <w:t xml:space="preserve"> dot1x pae authenticator</w:t>
+      </w:r>
+      <w:r>
+        <w:br/>
+      </w:r>
+      <w:r>
+        <w:rPr>
+          <w:rStyle w:val="VerbatimChar"/>
+        </w:rPr>
+        <w:t xml:space="preserve"> dot1x timeout tx-period 10</w:t>
+      </w:r>
+      <w:r>
+        <w:br/>
+      </w:r>
+      <w:r>
+        <w:rPr>
+          <w:rStyle w:val="VerbatimChar"/>
+        </w:rPr>
+        <w:t xml:space="preserve"> dot1x max-reauth-req 3</w:t>
+      </w:r>
+      <w:r>
+        <w:br/>
+      </w:r>
+      <w:r>
+        <w:rPr>
+          <w:rStyle w:val="VerbatimChar"/>
+        </w:rPr>
+        <w:t xml:space="preserve"> spanning-tree portfast</w:t>
+      </w:r>
+      <w:r>
+        <w:br/>
+      </w:r>
+      <w:r>
+        <w:rPr>
+          <w:rStyle w:val="VerbatimChar"/>
+        </w:rPr>
+        <w:t xml:space="preserve"> ip dhcp snooping limit rate 15</w:t>
+      </w:r>
+    </w:p>
+    <w:p>
+      <w:pPr>
+        <w:pStyle w:val="FirstParagraph"/>
+      </w:pPr>
+      <w:r>
+        <w:t xml:space="preserve">The</w:t>
+      </w:r>
+      <w:r>
+        <w:t xml:space="preserve"> </w:t>
+      </w:r>
+      <w:r>
+        <w:rPr>
+          <w:rStyle w:val="VerbatimChar"/>
+        </w:rPr>
+        <w:t xml:space="preserve">authentication order dot1x mab</w:t>
+      </w:r>
+      <w:r>
+        <w:t xml:space="preserve"> </w:t>
+      </w:r>
+      <w:r>
+        <w:t xml:space="preserve">line implements the fallback sequence: the port attempts 802.1X first (30-second window for a supplicant to respond). If no 802.1X supplicant responds, the port falls back to MAC Authentication Bypass (MAB) for devices that cannot participate in 802.1X (printers, IP phones, badge readers). MAB is covered in Section 6.</w:t>
+      </w:r>
+    </w:p>
+    <w:bookmarkEnd w:id="47"/>
+    <w:bookmarkEnd w:id="48"/>
+    <w:bookmarkStart w:id="56" w:name="X2294e353f63bbf43a569a1eeee897fe8ad8488c"/>
+    <w:p>
+      <w:pPr>
+        <w:pStyle w:val="Heading1"/>
+      </w:pPr>
+      <w:r>
+        <w:t xml:space="preserve">5. Certificate Infrastructure and Device Enrollment</w:t>
+      </w:r>
+    </w:p>
+    <w:bookmarkStart w:id="49" w:name="the-certificate-trust-chain"/>
+    <w:p>
+      <w:pPr>
+        <w:pStyle w:val="Heading2"/>
+      </w:pPr>
+      <w:r>
+        <w:t xml:space="preserve">5.1 The Certificate Trust Chain</w:t>
+      </w:r>
+    </w:p>
+    <w:p>
+      <w:pPr>
+        <w:pStyle w:val="FirstParagraph"/>
+      </w:pPr>
+      <w:r>
+        <w:t xml:space="preserve">NAC with EAP-TLS requires every managed device to hold a machine certificate trusted by the RADIUS server’s CA. This certificate is distinct from the user certificate (used for user authentication to Entra ID). The machine certificate proves device identity — that this physical device is an SSA-enrolled managed endpoint — independently of which user is logged in.</w:t>
+      </w:r>
+    </w:p>
+    <w:p>
+      <w:pPr>
+        <w:pStyle w:val="BodyText"/>
+      </w:pPr>
+      <w:r>
+        <w:t xml:space="preserve">The certificate trust chain for SSA GCC Moderate NAC:</w:t>
+      </w:r>
+    </w:p>
+    <w:p>
+      <w:pPr>
+        <w:pStyle w:val="SourceCode"/>
+      </w:pPr>
+      <w:r>
+        <w:rPr>
+          <w:rStyle w:val="VerbatimChar"/>
+        </w:rPr>
+        <w:t xml:space="preserve">Entra ID Certificate Authority (Root)</w:t>
+      </w:r>
+      <w:r>
+        <w:br/>
+      </w:r>
+      <w:r>
+        <w:rPr>
+          <w:rStyle w:val="VerbatimChar"/>
+        </w:rPr>
+        <w:t xml:space="preserve">  └─ SSA Device Identity CA (Intermediate, deployed via Intune)</w:t>
+      </w:r>
+      <w:r>
+        <w:br/>
+      </w:r>
+      <w:r>
+        <w:rPr>
+          <w:rStyle w:val="VerbatimChar"/>
+        </w:rPr>
+        <w:t xml:space="preserve">       └─ Device Machine Certificates (issued per-device at enrollment)</w:t>
+      </w:r>
+    </w:p>
+    <w:p>
+      <w:pPr>
+        <w:pStyle w:val="FirstParagraph"/>
+      </w:pPr>
+      <w:r>
+        <w:t xml:space="preserve">The RADIUS server (NPS) is configured to trust the SSA Device Identity CA. Any device that presents a certificate signed by this CA and passes the revocation check is recognized as a managed SSA device.</w:t>
+      </w:r>
+    </w:p>
+    <w:bookmarkEnd w:id="49"/>
+    <w:bookmarkStart w:id="54" w:name="intune-scep-certificate-enrollment"/>
+    <w:p>
+      <w:pPr>
+        <w:pStyle w:val="Heading2"/>
+      </w:pPr>
+      <w:r>
+        <w:t xml:space="preserve">5.2 Intune SCEP Certificate Enrollment</w:t>
+      </w:r>
+    </w:p>
+    <w:p>
+      <w:pPr>
+        <w:pStyle w:val="FirstParagraph"/>
+      </w:pPr>
+      <w:r>
+        <w:t xml:space="preserve">Certificates are provisioned via Simple Certificate Enrollment Protocol (SCEP), configured as an Intune device configuration profile. The enrollment flow:</w:t>
+      </w:r>
+    </w:p>
+    <w:p>
+      <w:pPr>
+        <w:pStyle w:val="Compact"/>
+        <w:numPr>
+          <w:ilvl w:val="0"/>
+          <w:numId w:val="1005"/>
+        </w:numPr>
+      </w:pPr>
+      <w:r>
+        <w:t xml:space="preserve">Device completes Intune enrollment (Autopilot or manual MDM enrollment).</w:t>
+      </w:r>
+    </w:p>
+    <w:p>
+      <w:pPr>
+        <w:pStyle w:val="Compact"/>
+        <w:numPr>
+          <w:ilvl w:val="0"/>
+          <w:numId w:val="1005"/>
+        </w:numPr>
+      </w:pPr>
+      <w:r>
+        <w:t xml:space="preserve">Intune pushes the SCEP certificate profile to the device.</w:t>
+      </w:r>
+    </w:p>
+    <w:p>
+      <w:pPr>
+        <w:pStyle w:val="Compact"/>
+        <w:numPr>
+          <w:ilvl w:val="0"/>
+          <w:numId w:val="1005"/>
+        </w:numPr>
+      </w:pPr>
+      <w:r>
+        <w:t xml:space="preserve">The device generates a key pair locally (private key never leaves the device — stored in TPM where available).</w:t>
+      </w:r>
+    </w:p>
+    <w:p>
+      <w:pPr>
+        <w:pStyle w:val="Compact"/>
+        <w:numPr>
+          <w:ilvl w:val="0"/>
+          <w:numId w:val="1005"/>
+        </w:numPr>
+      </w:pPr>
+      <w:r>
+        <w:t xml:space="preserve">The device sends a SCEP certificate request to the Intune SCEP connector (NDES server or cloud SCEP).</w:t>
+      </w:r>
+    </w:p>
+    <w:p>
+      <w:pPr>
+        <w:pStyle w:val="Compact"/>
+        <w:numPr>
+          <w:ilvl w:val="0"/>
+          <w:numId w:val="1005"/>
+        </w:numPr>
+      </w:pPr>
+      <w:r>
+        <w:t xml:space="preserve">The SCEP connector forwards the request to the issuing CA after validating the Intune enrollment token.</w:t>
+      </w:r>
+    </w:p>
+    <w:p>
+      <w:pPr>
+        <w:pStyle w:val="Compact"/>
+        <w:numPr>
+          <w:ilvl w:val="0"/>
+          <w:numId w:val="1005"/>
+        </w:numPr>
+      </w:pPr>
+      <w:r>
+        <w:t xml:space="preserve">The CA issues the certificate and returns it to the device via SCEP.</w:t>
+      </w:r>
+    </w:p>
+    <w:p>
+      <w:pPr>
+        <w:pStyle w:val="Compact"/>
+        <w:numPr>
+          <w:ilvl w:val="0"/>
+          <w:numId w:val="1005"/>
+        </w:numPr>
+      </w:pPr>
+      <w:r>
+        <w:t xml:space="preserve">The device installs the certificate in the Computer certificate store (not the user store — this is critical for machine authentication to work before any user logs in).</w:t>
+      </w:r>
+    </w:p>
+    <w:tbl>
+      <w:tblPr>
+        <w:tblStyle w:val="Table"/>
+        <w:tblW w:type="pct" w:w="5000"/>
+        <w:tblLayout w:type="fixed"/>
+        <w:tblLook w:firstRow="0" w:lastRow="0" w:firstColumn="0" w:lastColumn="0" w:noHBand="0" w:noVBand="0" w:val="0000"/>
+      </w:tblPr>
+      <w:tblGrid>
+        <w:gridCol w:w="7920"/>
+      </w:tblGrid>
+      <w:tr>
+        <w:tc>
+          <w:tcPr/>
+          <w:bookmarkStart w:id="53" w:name="fig-nac03"/>
+          <w:p>
+            <w:pPr>
+              <w:pStyle w:val="Compact"/>
+              <w:jc w:val="center"/>
+            </w:pPr>
+            <w:r>
+              <w:drawing>
+                <wp:inline>
+                  <wp:extent cx="5334000" cy="3000375"/>
+                  <wp:effectExtent b="0" l="0" r="0" t="0"/>
+                  <wp:docPr descr="" title="" id="51" name="Picture"/>
+                  <a:graphic>
+                    <a:graphicData uri="http://schemas.openxmlformats.org/drawingml/2006/picture">
+                      <pic:pic>
+                        <pic:nvPicPr>
+                          <pic:cNvPr descr="figs/nac-fig-03-cert-enrollment.png" id="52" name="Picture"/>
+                          <pic:cNvPicPr>
+                            <a:picLocks noChangeArrowheads="1" noChangeAspect="1"/>
+                          </pic:cNvPicPr>
+                        </pic:nvPicPr>
+                        <pic:blipFill>
+                          <a:blip r:embed="rId50"/>
+                          <a:stretch>
+                            <a:fillRect/>
+                          </a:stretch>
+                        </pic:blipFill>
+                        <pic:spPr bwMode="auto">
+                          <a:xfrm>
+                            <a:off x="0" y="0"/>
+                            <a:ext cx="5334000" cy="3000375"/>
+                          </a:xfrm>
+                          <a:prstGeom prst="rect">
+                            <a:avLst/>
+                          </a:prstGeom>
+                          <a:noFill/>
+                          <a:ln w="9525">
+                            <a:noFill/>
+                            <a:headEnd/>
+                            <a:tailEnd/>
+                          </a:ln>
+                        </pic:spPr>
+                      </pic:pic>
+                    </a:graphicData>
+                  </a:graphic>
+                </wp:inline>
+              </w:drawing>
+            </w:r>
+          </w:p>
+          <w:p>
+            <w:pPr>
+              <w:jc w:val="center"/>
+            </w:pPr>
+            <w:pPr>
+              <w:jc w:val="left"/>
+              <w:spacing w:before="200"/>
+              <w:pStyle w:val="ImageCaption"/>
+            </w:pPr>
+            <w:r>
+              <w:t xml:space="preserve">Figure 6: Certificate enrollment flow from device Intune enrollment through SCEP to machine certificate installation in the computer store</w:t>
+            </w:r>
+          </w:p>
+          <w:bookmarkEnd w:id="53"/>
+        </w:tc>
+      </w:tr>
+    </w:tbl>
+    <w:p>
+      <w:pPr>
+        <w:pStyle w:val="BodyText"/>
+      </w:pPr>
+      <w:r>
+        <w:rPr>
+          <w:b/>
+          <w:bCs/>
+        </w:rPr>
+        <w:t xml:space="preserve">Intune SCEP Profile — Key Parameters:</w:t>
+      </w:r>
+    </w:p>
+    <w:p>
+      <w:pPr>
+        <w:pStyle w:val="SourceCode"/>
+      </w:pPr>
+      <w:r>
+        <w:rPr>
+          <w:rStyle w:val="FunctionTok"/>
+        </w:rPr>
+        <w:t xml:space="preserve">{</w:t>
+      </w:r>
+      <w:r>
+        <w:br/>
+      </w:r>
+      <w:r>
+        <w:rPr>
+          <w:rStyle w:val="NormalTok"/>
+        </w:rPr>
+        <w:t xml:space="preserve">  </w:t>
+      </w:r>
+      <w:r>
+        <w:rPr>
+          <w:rStyle w:val="DataTypeTok"/>
+        </w:rPr>
+        <w:t xml:space="preserve">"certificateStore"</w:t>
+      </w:r>
+      <w:r>
+        <w:rPr>
+          <w:rStyle w:val="FunctionTok"/>
+        </w:rPr>
+        <w:t xml:space="preserve">:</w:t>
+      </w:r>
+      <w:r>
+        <w:rPr>
+          <w:rStyle w:val="NormalTok"/>
+        </w:rPr>
+        <w:t xml:space="preserve"> </w:t>
+      </w:r>
+      <w:r>
+        <w:rPr>
+          <w:rStyle w:val="StringTok"/>
+        </w:rPr>
+        <w:t xml:space="preserve">"Machine"</w:t>
+      </w:r>
+      <w:r>
+        <w:rPr>
+          <w:rStyle w:val="FunctionTok"/>
+        </w:rPr>
+        <w:t xml:space="preserve">,</w:t>
+      </w:r>
+      <w:r>
+        <w:br/>
+      </w:r>
+      <w:r>
+        <w:rPr>
+          <w:rStyle w:val="NormalTok"/>
+        </w:rPr>
+        <w:t xml:space="preserve">  </w:t>
+      </w:r>
+      <w:r>
+        <w:rPr>
+          <w:rStyle w:val="DataTypeTok"/>
+        </w:rPr>
+        <w:t xml:space="preserve">"keyUsage"</w:t>
+      </w:r>
+      <w:r>
+        <w:rPr>
+          <w:rStyle w:val="FunctionTok"/>
+        </w:rPr>
+        <w:t xml:space="preserve">:</w:t>
+      </w:r>
+      <w:r>
+        <w:rPr>
+          <w:rStyle w:val="NormalTok"/>
+        </w:rPr>
+        <w:t xml:space="preserve"> </w:t>
+      </w:r>
+      <w:r>
+        <w:rPr>
+          <w:rStyle w:val="StringTok"/>
+        </w:rPr>
+        <w:t xml:space="preserve">"DigitalSignature, KeyEncipherment"</w:t>
+      </w:r>
+      <w:r>
+        <w:rPr>
+          <w:rStyle w:val="FunctionTok"/>
+        </w:rPr>
+        <w:t xml:space="preserve">,</w:t>
+      </w:r>
+      <w:r>
+        <w:br/>
+      </w:r>
+      <w:r>
+        <w:rPr>
+          <w:rStyle w:val="NormalTok"/>
+        </w:rPr>
+        <w:t xml:space="preserve">  </w:t>
+      </w:r>
+      <w:r>
+        <w:rPr>
+          <w:rStyle w:val="DataTypeTok"/>
+        </w:rPr>
+        <w:t xml:space="preserve">"subjectNameFormat"</w:t>
+      </w:r>
+      <w:r>
+        <w:rPr>
+          <w:rStyle w:val="FunctionTok"/>
+        </w:rPr>
+        <w:t xml:space="preserve">:</w:t>
+      </w:r>
+      <w:r>
+        <w:rPr>
+          <w:rStyle w:val="NormalTok"/>
+        </w:rPr>
+        <w:t xml:space="preserve"> </w:t>
+      </w:r>
+      <w:r>
+        <w:rPr>
+          <w:rStyle w:val="StringTok"/>
+        </w:rPr>
+        <w:t xml:space="preserve">"CN={{DeviceName}}"</w:t>
+      </w:r>
+      <w:r>
+        <w:rPr>
+          <w:rStyle w:val="FunctionTok"/>
+        </w:rPr>
+        <w:t xml:space="preserve">,</w:t>
+      </w:r>
+      <w:r>
+        <w:br/>
+      </w:r>
+      <w:r>
+        <w:rPr>
+          <w:rStyle w:val="NormalTok"/>
+        </w:rPr>
+        <w:t xml:space="preserve">  </w:t>
+      </w:r>
+      <w:r>
+        <w:rPr>
+          <w:rStyle w:val="DataTypeTok"/>
+        </w:rPr>
+        <w:t xml:space="preserve">"subjectAlternativeNameType"</w:t>
+      </w:r>
+      <w:r>
+        <w:rPr>
+          <w:rStyle w:val="FunctionTok"/>
+        </w:rPr>
+        <w:t xml:space="preserve">:</w:t>
+      </w:r>
+      <w:r>
+        <w:rPr>
+          <w:rStyle w:val="NormalTok"/>
+        </w:rPr>
+        <w:t xml:space="preserve"> </w:t>
+      </w:r>
+      <w:r>
+        <w:rPr>
+          <w:rStyle w:val="StringTok"/>
+        </w:rPr>
+        <w:t xml:space="preserve">"UserPrincipalName"</w:t>
+      </w:r>
+      <w:r>
+        <w:rPr>
+          <w:rStyle w:val="FunctionTok"/>
+        </w:rPr>
+        <w:t xml:space="preserve">,</w:t>
+      </w:r>
+      <w:r>
+        <w:br/>
+      </w:r>
+      <w:r>
+        <w:rPr>
+          <w:rStyle w:val="NormalTok"/>
+        </w:rPr>
+        <w:t xml:space="preserve">  </w:t>
+      </w:r>
+      <w:r>
+        <w:rPr>
+          <w:rStyle w:val="DataTypeTok"/>
+        </w:rPr>
+        <w:t xml:space="preserve">"subjectAlternativeNameValue"</w:t>
+      </w:r>
+      <w:r>
+        <w:rPr>
+          <w:rStyle w:val="FunctionTok"/>
+        </w:rPr>
+        <w:t xml:space="preserve">:</w:t>
+      </w:r>
+      <w:r>
+        <w:rPr>
+          <w:rStyle w:val="NormalTok"/>
+        </w:rPr>
+        <w:t xml:space="preserve"> </w:t>
+      </w:r>
+      <w:r>
+        <w:rPr>
+          <w:rStyle w:val="StringTok"/>
+        </w:rPr>
+        <w:t xml:space="preserve">"{{DeviceId}}@ssagov.onmicrosoft.com"</w:t>
+      </w:r>
+      <w:r>
+        <w:rPr>
+          <w:rStyle w:val="FunctionTok"/>
+        </w:rPr>
+        <w:t xml:space="preserve">,</w:t>
+      </w:r>
+      <w:r>
+        <w:br/>
+      </w:r>
+      <w:r>
+        <w:rPr>
+          <w:rStyle w:val="NormalTok"/>
+        </w:rPr>
+        <w:t xml:space="preserve">  </w:t>
+      </w:r>
+      <w:r>
+        <w:rPr>
+          <w:rStyle w:val="DataTypeTok"/>
+        </w:rPr>
+        <w:t xml:space="preserve">"certificateValidityPeriodValue"</w:t>
+      </w:r>
+      <w:r>
+        <w:rPr>
+          <w:rStyle w:val="FunctionTok"/>
+        </w:rPr>
+        <w:t xml:space="preserve">:</w:t>
+      </w:r>
+      <w:r>
+        <w:rPr>
+          <w:rStyle w:val="NormalTok"/>
+        </w:rPr>
+        <w:t xml:space="preserve"> </w:t>
+      </w:r>
+      <w:r>
+        <w:rPr>
+          <w:rStyle w:val="DecValTok"/>
+        </w:rPr>
+        <w:t xml:space="preserve">1</w:t>
+      </w:r>
+      <w:r>
+        <w:rPr>
+          <w:rStyle w:val="FunctionTok"/>
+        </w:rPr>
+        <w:t xml:space="preserve">,</w:t>
+      </w:r>
+      <w:r>
+        <w:br/>
+      </w:r>
+      <w:r>
+        <w:rPr>
+          <w:rStyle w:val="NormalTok"/>
+        </w:rPr>
+        <w:t xml:space="preserve">  </w:t>
+      </w:r>
+      <w:r>
+        <w:rPr>
+          <w:rStyle w:val="DataTypeTok"/>
+        </w:rPr>
+        <w:t xml:space="preserve">"certificateValidityPeriodScale"</w:t>
+      </w:r>
+      <w:r>
+        <w:rPr>
+          <w:rStyle w:val="FunctionTok"/>
+        </w:rPr>
+        <w:t xml:space="preserve">:</w:t>
+      </w:r>
+      <w:r>
+        <w:rPr>
+          <w:rStyle w:val="NormalTok"/>
+        </w:rPr>
+        <w:t xml:space="preserve"> </w:t>
+      </w:r>
+      <w:r>
+        <w:rPr>
+          <w:rStyle w:val="StringTok"/>
+        </w:rPr>
+        <w:t xml:space="preserve">"Years"</w:t>
+      </w:r>
+      <w:r>
+        <w:rPr>
+          <w:rStyle w:val="FunctionTok"/>
+        </w:rPr>
+        <w:t xml:space="preserve">,</w:t>
+      </w:r>
+      <w:r>
+        <w:br/>
+      </w:r>
+      <w:r>
+        <w:rPr>
+          <w:rStyle w:val="NormalTok"/>
+        </w:rPr>
+        <w:t xml:space="preserve">  </w:t>
+      </w:r>
+      <w:r>
+        <w:rPr>
+          <w:rStyle w:val="DataTypeTok"/>
+        </w:rPr>
+        <w:t xml:space="preserve">"renewalThresholdPercentage"</w:t>
+      </w:r>
+      <w:r>
+        <w:rPr>
+          <w:rStyle w:val="FunctionTok"/>
+        </w:rPr>
+        <w:t xml:space="preserve">:</w:t>
+      </w:r>
+      <w:r>
+        <w:rPr>
+          <w:rStyle w:val="NormalTok"/>
+        </w:rPr>
+        <w:t xml:space="preserve"> </w:t>
+      </w:r>
+      <w:r>
+        <w:rPr>
+          <w:rStyle w:val="DecValTok"/>
+        </w:rPr>
+        <w:t xml:space="preserve">20</w:t>
+      </w:r>
+      <w:r>
+        <w:rPr>
+          <w:rStyle w:val="FunctionTok"/>
+        </w:rPr>
+        <w:t xml:space="preserve">,</w:t>
+      </w:r>
+      <w:r>
+        <w:br/>
+      </w:r>
+      <w:r>
+        <w:rPr>
+          <w:rStyle w:val="NormalTok"/>
+        </w:rPr>
+        <w:t xml:space="preserve">  </w:t>
+      </w:r>
+      <w:r>
+        <w:rPr>
+          <w:rStyle w:val="DataTypeTok"/>
+        </w:rPr>
+        <w:t xml:space="preserve">"keyStorageProvider"</w:t>
+      </w:r>
+      <w:r>
+        <w:rPr>
+          <w:rStyle w:val="FunctionTok"/>
+        </w:rPr>
+        <w:t xml:space="preserve">:</w:t>
+      </w:r>
+      <w:r>
+        <w:rPr>
+          <w:rStyle w:val="NormalTok"/>
+        </w:rPr>
+        <w:t xml:space="preserve"> </w:t>
+      </w:r>
+      <w:r>
+        <w:rPr>
+          <w:rStyle w:val="StringTok"/>
+        </w:rPr>
+        <w:t xml:space="preserve">"Enroll to TPM KSP if present, otherwise Software KSP"</w:t>
+      </w:r>
+      <w:r>
+        <w:rPr>
+          <w:rStyle w:val="FunctionTok"/>
+        </w:rPr>
+        <w:t xml:space="preserve">,</w:t>
+      </w:r>
+      <w:r>
+        <w:br/>
+      </w:r>
+      <w:r>
+        <w:rPr>
+          <w:rStyle w:val="NormalTok"/>
+        </w:rPr>
+        <w:t xml:space="preserve">  </w:t>
+      </w:r>
+      <w:r>
+        <w:rPr>
+          <w:rStyle w:val="DataTypeTok"/>
+        </w:rPr>
+        <w:t xml:space="preserve">"scepServerUrls"</w:t>
+      </w:r>
+      <w:r>
+        <w:rPr>
+          <w:rStyle w:val="FunctionTok"/>
+        </w:rPr>
+        <w:t xml:space="preserve">:</w:t>
+      </w:r>
+      <w:r>
+        <w:rPr>
+          <w:rStyle w:val="NormalTok"/>
+        </w:rPr>
+        <w:t xml:space="preserve"> </w:t>
+      </w:r>
+      <w:r>
+        <w:rPr>
+          <w:rStyle w:val="OtherTok"/>
+        </w:rPr>
+        <w:t xml:space="preserve">[</w:t>
+      </w:r>
+      <w:r>
+        <w:rPr>
+          <w:rStyle w:val="StringTok"/>
+        </w:rPr>
+        <w:t xml:space="preserve">"https://ndes.ssagov.onmicrosoft.com/certsrv/mscep/mscep.dll"</w:t>
+      </w:r>
+      <w:r>
+        <w:rPr>
+          <w:rStyle w:val="OtherTok"/>
+        </w:rPr>
+        <w:t xml:space="preserve">]</w:t>
+      </w:r>
+      <w:r>
+        <w:br/>
+      </w:r>
+      <w:r>
+        <w:rPr>
+          <w:rStyle w:val="FunctionTok"/>
+        </w:rPr>
+        <w:t xml:space="preserve">}</w:t>
+      </w:r>
+    </w:p>
+    <w:p>
+      <w:pPr>
+        <w:pStyle w:val="FirstParagraph"/>
+      </w:pPr>
+      <w:r>
+        <w:t xml:space="preserve">The</w:t>
+      </w:r>
+      <w:r>
+        <w:t xml:space="preserve"> </w:t>
+      </w:r>
+      <w:r>
+        <w:rPr>
+          <w:rStyle w:val="VerbatimChar"/>
+        </w:rPr>
+        <w:t xml:space="preserve">subjectAlternativeNameValue</w:t>
+      </w:r>
+      <w:r>
+        <w:t xml:space="preserve"> </w:t>
+      </w:r>
+      <w:r>
+        <w:t xml:space="preserve">uses</w:t>
+      </w:r>
+      <w:r>
+        <w:t xml:space="preserve"> </w:t>
+      </w:r>
+      <w:r>
+        <w:rPr>
+          <w:rStyle w:val="VerbatimChar"/>
+        </w:rPr>
+        <w:t xml:space="preserve">{DeviceId}</w:t>
+      </w:r>
+      <w:r>
+        <w:t xml:space="preserve"> </w:t>
+      </w:r>
+      <w:r>
+        <w:t xml:space="preserve">— the Intune Device ID. The NPS policy is configured to validate that the SAN in the presented certificate corresponds to an active, compliant device in the Entra ID device inventory via the Graph API. A certificate from a device that has since been wiped, deleted from Entra ID, or marked non-compliant is rejected even if the certificate itself has not expired.</w:t>
+      </w:r>
+    </w:p>
+    <w:bookmarkEnd w:id="54"/>
+    <w:bookmarkStart w:id="55" w:name="certificate-revocation"/>
+    <w:p>
+      <w:pPr>
+        <w:pStyle w:val="Heading2"/>
+      </w:pPr>
+      <w:r>
+        <w:t xml:space="preserve">5.3 Certificate Revocation</w:t>
+      </w:r>
+    </w:p>
+    <w:p>
+      <w:pPr>
+        <w:pStyle w:val="FirstParagraph"/>
+      </w:pPr>
+      <w:r>
+        <w:t xml:space="preserve">Two revocation mechanisms operate in parallel:</w:t>
+      </w:r>
+    </w:p>
+    <w:p>
+      <w:pPr>
+        <w:pStyle w:val="Compact"/>
+        <w:numPr>
+          <w:ilvl w:val="0"/>
+          <w:numId w:val="1006"/>
+        </w:numPr>
+      </w:pPr>
+      <w:r>
+        <w:rPr>
+          <w:b/>
+          <w:bCs/>
+        </w:rPr>
+        <w:t xml:space="preserve">CRL (Certificate Revocation List)</w:t>
+      </w:r>
+      <w:r>
+        <w:t xml:space="preserve"> </w:t>
+      </w:r>
+      <w:r>
+        <w:t xml:space="preserve">— the CA publishes a CRL every 24 hours. NPS checks the CRL before accepting a certificate. The CRL distribution point URL must be reachable from all NPS servers (HTTP, not LDAP, for resilience).</w:t>
+      </w:r>
+    </w:p>
+    <w:p>
+      <w:pPr>
+        <w:pStyle w:val="Compact"/>
+        <w:numPr>
+          <w:ilvl w:val="0"/>
+          <w:numId w:val="1006"/>
+        </w:numPr>
+      </w:pPr>
+      <w:r>
+        <w:rPr>
+          <w:b/>
+          <w:bCs/>
+        </w:rPr>
+        <w:t xml:space="preserve">OCSP (Online Certificate Status Protocol)</w:t>
+      </w:r>
+      <w:r>
+        <w:t xml:space="preserve"> </w:t>
+      </w:r>
+      <w:r>
+        <w:t xml:space="preserve">— for real-time revocation checks. The CA’s OCSP responder answers per-certificate status queries in under 500ms. NPS queries OCSP on every authentication if the CA supports it and the certificate includes an OCSP stapling extension.</w:t>
+      </w:r>
+    </w:p>
+    <w:p>
+      <w:pPr>
+        <w:pStyle w:val="FirstParagraph"/>
+      </w:pPr>
+      <w:r>
+        <w:t xml:space="preserve">When a device is decommissioned, stolen, or wiped, the device certificate is revoked in the CA within the same change window. The next 802.1X re-authentication (which occurs every 8 hours per the NPS policy) will fail the revocation check and move the port to the quarantine VLAN.</w:t>
+      </w:r>
+    </w:p>
+    <w:bookmarkEnd w:id="55"/>
+    <w:bookmarkEnd w:id="56"/>
+    <w:bookmarkStart w:id="68" w:name="nac-policy-tier-structure"/>
+    <w:p>
+      <w:pPr>
+        <w:pStyle w:val="Heading1"/>
+      </w:pPr>
+      <w:r>
+        <w:t xml:space="preserve">6. NAC Policy Tier Structure</w:t>
+      </w:r>
+    </w:p>
+    <w:bookmarkStart w:id="61" w:name="overview"/>
+    <w:p>
+      <w:pPr>
+        <w:pStyle w:val="Heading2"/>
+      </w:pPr>
+      <w:r>
+        <w:t xml:space="preserve">6.1 Overview</w:t>
+      </w:r>
+    </w:p>
+    <w:p>
+      <w:pPr>
+        <w:pStyle w:val="FirstParagraph"/>
+      </w:pPr>
+      <w:r>
+        <w:t xml:space="preserve">The RADIUS server returns a VLAN assignment (and optionally a filter policy and session timeout) for each authenticated device. The VLAN assignment is the enforcement mechanism — it determines which network segment the device enters and therefore which resources it can reach.</w:t>
+      </w:r>
+    </w:p>
+    <w:tbl>
+      <w:tblPr>
+        <w:tblStyle w:val="Table"/>
+        <w:tblW w:type="pct" w:w="5000"/>
+        <w:tblLayout w:type="fixed"/>
+        <w:tblLook w:firstRow="0" w:lastRow="0" w:firstColumn="0" w:lastColumn="0" w:noHBand="0" w:noVBand="0" w:val="0000"/>
+      </w:tblPr>
+      <w:tblGrid>
+        <w:gridCol w:w="7920"/>
+      </w:tblGrid>
+      <w:tr>
+        <w:tc>
+          <w:tcPr/>
+          <w:bookmarkStart w:id="60" w:name="fig-nac04"/>
+          <w:p>
+            <w:pPr>
+              <w:pStyle w:val="Compact"/>
+              <w:jc w:val="center"/>
+            </w:pPr>
+            <w:r>
+              <w:drawing>
+                <wp:inline>
+                  <wp:extent cx="5334000" cy="3000375"/>
+                  <wp:effectExtent b="0" l="0" r="0" t="0"/>
+                  <wp:docPr descr="" title="" id="58" name="Picture"/>
+                  <a:graphic>
+                    <a:graphicData uri="http://schemas.openxmlformats.org/drawingml/2006/picture">
+                      <pic:pic>
+                        <pic:nvPicPr>
+                          <pic:cNvPr descr="figs/nac-fig-04-policy-tiers.png" id="59" name="Picture"/>
+                          <pic:cNvPicPr>
+                            <a:picLocks noChangeArrowheads="1" noChangeAspect="1"/>
+                          </pic:cNvPicPr>
+                        </pic:nvPicPr>
+                        <pic:blipFill>
+                          <a:blip r:embed="rId57"/>
+                          <a:stretch>
+                            <a:fillRect/>
+                          </a:stretch>
+                        </pic:blipFill>
+                        <pic:spPr bwMode="auto">
+                          <a:xfrm>
+                            <a:off x="0" y="0"/>
+                            <a:ext cx="5334000" cy="3000375"/>
+                          </a:xfrm>
+                          <a:prstGeom prst="rect">
+                            <a:avLst/>
+                          </a:prstGeom>
+                          <a:noFill/>
+                          <a:ln w="9525">
+                            <a:noFill/>
+                            <a:headEnd/>
+                            <a:tailEnd/>
+                          </a:ln>
+                        </pic:spPr>
+                      </pic:pic>
+                    </a:graphicData>
+                  </a:graphic>
+                </wp:inline>
+              </w:drawing>
+            </w:r>
+          </w:p>
+          <w:p>
+            <w:pPr>
+              <w:jc w:val="center"/>
+            </w:pPr>
+            <w:pPr>
+              <w:jc w:val="left"/>
+              <w:spacing w:before="200"/>
+              <w:pStyle w:val="ImageCaption"/>
+            </w:pPr>
+            <w:r>
+              <w:t xml:space="preserve">Figure 7: NAC policy tier diagram showing three VLANs and the policy path from 802.1X authentication through RADIUS compliance check to VLAN assignment</w:t>
+            </w:r>
+          </w:p>
+          <w:bookmarkEnd w:id="60"/>
         </w:tc>
       </w:tr>
     </w:tbl>
@@ -3350,8 +3608,8 @@
         </w:tc>
       </w:tr>
     </w:tbl>
-    <w:bookmarkEnd w:id="49"/>
-    <w:bookmarkStart w:id="50" w:name="production-vlan"/>
+    <w:bookmarkEnd w:id="61"/>
+    <w:bookmarkStart w:id="62" w:name="production-vlan"/>
     <w:p>
       <w:pPr>
         <w:pStyle w:val="Heading2"/>
@@ -3515,8 +3773,8 @@
         <w:t xml:space="preserve">A device that passes certificate validation but fails any compliance check is placed in the Remediation VLAN — it is never silently admitted to production. The Intune compliance status is re-evaluated on the 8-hour RADIUS session re-authentication. A device that fails compliance mid-day receives a Change of Authorization (CoA) message from the NAC policy engine and is moved from the production VLAN to the Remediation VLAN without requiring physical port action.</w:t>
       </w:r>
     </w:p>
-    <w:bookmarkEnd w:id="50"/>
-    <w:bookmarkStart w:id="51" w:name="remediation-vlan"/>
+    <w:bookmarkEnd w:id="62"/>
+    <w:bookmarkStart w:id="63" w:name="remediation-vlan"/>
     <w:p>
       <w:pPr>
         <w:pStyle w:val="Heading2"/>
@@ -3691,8 +3949,8 @@
         <w:t xml:space="preserve">state in Intune, the NAC policy engine sends a RADIUS CoA to the switch and the port is moved to the production VLAN without requiring manual intervention or a physical reconnect.</w:t>
       </w:r>
     </w:p>
-    <w:bookmarkEnd w:id="51"/>
-    <w:bookmarkStart w:id="52" w:name="quarantine-vlan"/>
+    <w:bookmarkEnd w:id="63"/>
+    <w:bookmarkStart w:id="64" w:name="quarantine-vlan"/>
     <w:p>
       <w:pPr>
         <w:pStyle w:val="Heading2"/>
@@ -3733,8 +3991,8 @@
         <w:t xml:space="preserve">This prevents the user from believing the network is simply down and generating a flood of unrelated help desk calls.</w:t>
       </w:r>
     </w:p>
-    <w:bookmarkEnd w:id="52"/>
-    <w:bookmarkStart w:id="55" w:name="X3078d21c4d602b844659f443d791c6b5df2a64e"/>
+    <w:bookmarkEnd w:id="64"/>
+    <w:bookmarkStart w:id="67" w:name="X3078d21c4d602b844659f443d791c6b5df2a64e"/>
     <w:p>
       <w:pPr>
         <w:pStyle w:val="Heading2"/>
@@ -3844,12 +4102,12 @@
                 <wp:inline>
                   <wp:extent cx="152400" cy="152400"/>
                   <wp:effectExtent b="0" l="0" r="0" t="0"/>
-                  <wp:docPr descr="" title="" id="53" name="Picture"/>
+                  <wp:docPr descr="" title="" id="65" name="Picture"/>
                   <a:graphic>
                     <a:graphicData uri="http://schemas.openxmlformats.org/drawingml/2006/picture">
                       <pic:pic>
                         <pic:nvPicPr>
-                          <pic:cNvPr descr="/opt/quarto/share/formats/docx/warning.png" id="54" name="Picture"/>
+                          <pic:cNvPr descr="C:\Program Files\Quarto\share\formats\docx\warning.png" id="66" name="Picture"/>
                           <pic:cNvPicPr>
                             <a:picLocks noChangeArrowheads="1" noChangeAspect="1"/>
                           </pic:cNvPicPr>
@@ -3955,9 +4213,9 @@
         </w:tc>
       </w:tr>
     </w:tbl>
-    <w:bookmarkEnd w:id="55"/>
-    <w:bookmarkEnd w:id="56"/>
-    <w:bookmarkStart w:id="63" w:name="posture-assessment-integration"/>
+    <w:bookmarkEnd w:id="67"/>
+    <w:bookmarkEnd w:id="68"/>
+    <w:bookmarkStart w:id="75" w:name="posture-assessment-integration"/>
     <w:p>
       <w:pPr>
         <w:pStyle w:val="Heading1"/>
@@ -3966,7 +4224,7 @@
         <w:t xml:space="preserve">7. Posture Assessment Integration</w:t>
       </w:r>
     </w:p>
-    <w:bookmarkStart w:id="57" w:name="intune-compliance-as-the-posture-signal"/>
+    <w:bookmarkStart w:id="69" w:name="intune-compliance-as-the-posture-signal"/>
     <w:p>
       <w:pPr>
         <w:pStyle w:val="Heading2"/>
@@ -4035,8 +4293,8 @@
         <w:t xml:space="preserve">The NPS Extension for Intune NAC (or equivalent) reads the Intune compliance status for the device identified by the certificate SAN at authentication time and includes it in the RADIUS Access-Accept or Access-Reject.</w:t>
       </w:r>
     </w:p>
-    <w:bookmarkEnd w:id="57"/>
-    <w:bookmarkStart w:id="62" w:name="X82725fdb1b3c735ef3f4e5298aea4aabc52542d"/>
+    <w:bookmarkEnd w:id="69"/>
+    <w:bookmarkStart w:id="74" w:name="X82725fdb1b3c735ef3f4e5298aea4aabc52542d"/>
     <w:p>
       <w:pPr>
         <w:pStyle w:val="Heading2"/>
@@ -4101,7 +4359,7 @@
       <w:tr>
         <w:tc>
           <w:tcPr/>
-          <w:bookmarkStart w:id="61" w:name="fig-nac05"/>
+          <w:bookmarkStart w:id="73" w:name="fig-nac05"/>
           <w:p>
             <w:pPr>
               <w:pStyle w:val="Compact"/>
@@ -4112,18 +4370,18 @@
                 <wp:inline>
                   <wp:extent cx="5334000" cy="3000375"/>
                   <wp:effectExtent b="0" l="0" r="0" t="0"/>
-                  <wp:docPr descr="" title="" id="59" name="Picture"/>
+                  <wp:docPr descr="" title="" id="71" name="Picture"/>
                   <a:graphic>
                     <a:graphicData uri="http://schemas.openxmlformats.org/drawingml/2006/picture">
                       <pic:pic>
                         <pic:nvPicPr>
-                          <pic:cNvPr descr="figs/nac-fig-05-coa-flow.png" id="60" name="Picture"/>
+                          <pic:cNvPr descr="figs/nac-fig-05-coa-flow.png" id="72" name="Picture"/>
                           <pic:cNvPicPr>
                             <a:picLocks noChangeArrowheads="1" noChangeAspect="1"/>
                           </pic:cNvPicPr>
                         </pic:nvPicPr>
                         <pic:blipFill>
-                          <a:blip r:embed="rId58"/>
+                          <a:blip r:embed="rId70"/>
                           <a:stretch>
                             <a:fillRect/>
                           </a:stretch>
@@ -4160,16 +4418,16 @@
               <w:pStyle w:val="ImageCaption"/>
             </w:pPr>
             <w:r>
-              <w:t xml:space="preserve">Figure 5: RADIUS Change of Authorization flow showing real-time VLAN reassignment when Intune marks a device non-compliant</w:t>
-            </w:r>
-          </w:p>
-          <w:bookmarkEnd w:id="61"/>
+              <w:t xml:space="preserve">Figure 8: RADIUS Change of Authorization flow showing real-time VLAN reassignment when Intune marks a device non-compliant</w:t>
+            </w:r>
+          </w:p>
+          <w:bookmarkEnd w:id="73"/>
         </w:tc>
       </w:tr>
     </w:tbl>
-    <w:bookmarkEnd w:id="62"/>
-    <w:bookmarkEnd w:id="63"/>
-    <w:bookmarkStart w:id="67" w:name="wired-and-wireless-nac"/>
+    <w:bookmarkEnd w:id="74"/>
+    <w:bookmarkEnd w:id="75"/>
+    <w:bookmarkStart w:id="79" w:name="wired-and-wireless-nac"/>
     <w:p>
       <w:pPr>
         <w:pStyle w:val="Heading1"/>
@@ -4178,7 +4436,7 @@
         <w:t xml:space="preserve">8. Wired and Wireless NAC</w:t>
       </w:r>
     </w:p>
-    <w:bookmarkStart w:id="64" w:name="wired-802.1x"/>
+    <w:bookmarkStart w:id="76" w:name="wired-802.1x"/>
     <w:p>
       <w:pPr>
         <w:pStyle w:val="Heading2"/>
@@ -4234,8 +4492,8 @@
         <w:t xml:space="preserve">configuration allows both devices to authenticate independently: the phone authenticates via MAB (VLAN 300 / voice VLAN), and the PC authenticates via EAP-TLS (VLAN 100 / data VLAN). The switch tags the traffic from each device with the appropriate VLAN, and both devices coexist on the same physical port.</w:t>
       </w:r>
     </w:p>
-    <w:bookmarkEnd w:id="64"/>
-    <w:bookmarkStart w:id="65" w:name="wireless-802.1x-wpa3-enterprise"/>
+    <w:bookmarkEnd w:id="76"/>
+    <w:bookmarkStart w:id="77" w:name="wireless-802.1x-wpa3-enterprise"/>
     <w:p>
       <w:pPr>
         <w:pStyle w:val="Heading2"/>
@@ -4360,8 +4618,8 @@
         <w:t xml:space="preserve">The WPA3-Enterprise SSID presents the RADIUS server certificate to the supplicant during EAP-TLS negotiation. The Windows 802.1X supplicant (configured via Intune) is set to validate the server certificate against a pinned root CA — the Entra ID Certificate Authority. A rogue access point presenting a different certificate is rejected by the supplicant, preventing credential theft or session hijacking even if the rogue AP has the same SSID name.</w:t>
       </w:r>
     </w:p>
-    <w:bookmarkEnd w:id="65"/>
-    <w:bookmarkStart w:id="66" w:name="session-timeout-and-re-authentication"/>
+    <w:bookmarkEnd w:id="77"/>
+    <w:bookmarkStart w:id="78" w:name="session-timeout-and-re-authentication"/>
     <w:p>
       <w:pPr>
         <w:pStyle w:val="Heading2"/>
@@ -4542,9 +4800,9 @@
         <w:t xml:space="preserve">Re-authentication at 8 hours forces the RADIUS server to re-check certificate validity and Intune compliance at least once per shift, even without a CoA event. A device that was compliant at 08:00 but failed a compliance check at 14:00 will be moved to the Remediation VLAN no later than 16:00 (next re-auth) in the worst case, or within 20 minutes if the CoA agent is operational.</w:t>
       </w:r>
     </w:p>
-    <w:bookmarkEnd w:id="66"/>
-    <w:bookmarkEnd w:id="67"/>
-    <w:bookmarkStart w:id="74" w:name="infoblox-integration"/>
+    <w:bookmarkEnd w:id="78"/>
+    <w:bookmarkEnd w:id="79"/>
+    <w:bookmarkStart w:id="86" w:name="infoblox-integration"/>
     <w:p>
       <w:pPr>
         <w:pStyle w:val="Heading1"/>
@@ -4553,7 +4811,7 @@
         <w:t xml:space="preserve">9. InfoBlox Integration</w:t>
       </w:r>
     </w:p>
-    <w:bookmarkStart w:id="68" w:name="dhcp-fingerprinting-and-device-profiling"/>
+    <w:bookmarkStart w:id="80" w:name="dhcp-fingerprinting-and-device-profiling"/>
     <w:p>
       <w:pPr>
         <w:pStyle w:val="Heading2"/>
@@ -4612,8 +4870,8 @@
         <w:t xml:space="preserve">— a device that presents a valid SSA machine certificate but whose DHCP fingerprint does not match any known Windows/macOS pattern (e.g., a Linux system or Android device) generates an alert in Sentinel. This catches cases where a valid certificate has been extracted from a managed device and installed on an unauthorized system.</w:t>
       </w:r>
     </w:p>
-    <w:bookmarkEnd w:id="68"/>
-    <w:bookmarkStart w:id="73" w:name="ipam-driven-vlan-assignment"/>
+    <w:bookmarkEnd w:id="80"/>
+    <w:bookmarkStart w:id="85" w:name="ipam-driven-vlan-assignment"/>
     <w:p>
       <w:pPr>
         <w:pStyle w:val="Heading2"/>
@@ -4755,12 +5013,12 @@
                 <wp:inline>
                   <wp:extent cx="152400" cy="152400"/>
                   <wp:effectExtent b="0" l="0" r="0" t="0"/>
-                  <wp:docPr descr="" title="" id="69" name="Picture"/>
+                  <wp:docPr descr="" title="" id="81" name="Picture"/>
                   <a:graphic>
                     <a:graphicData uri="http://schemas.openxmlformats.org/drawingml/2006/picture">
                       <pic:pic>
                         <pic:nvPicPr>
-                          <pic:cNvPr descr="/opt/quarto/share/formats/docx/note.png" id="70" name="Picture"/>
+                          <pic:cNvPr descr="C:\Program Files\Quarto\share\formats\docx\note.png" id="82" name="Picture"/>
                           <pic:cNvPicPr>
                             <a:picLocks noChangeArrowheads="1" noChangeAspect="1"/>
                           </pic:cNvPicPr>
@@ -4921,7 +5179,7 @@
             <w:r>
               <w:t xml:space="preserve"> </w:t>
             </w:r>
-            <w:hyperlink r:id="rId71">
+            <w:hyperlink r:id="rId83">
               <w:r>
                 <w:rPr>
                   <w:rStyle w:val="Hyperlink"/>
@@ -4938,7 +5196,7 @@
             <w:r>
               <w:t xml:space="preserve"> </w:t>
             </w:r>
-            <w:hyperlink r:id="rId72">
+            <w:hyperlink r:id="rId84">
               <w:r>
                 <w:rPr>
                   <w:rStyle w:val="Hyperlink"/>
@@ -4954,9 +5212,9 @@
         </w:tc>
       </w:tr>
     </w:tbl>
-    <w:bookmarkEnd w:id="73"/>
-    <w:bookmarkEnd w:id="74"/>
-    <w:bookmarkStart w:id="77" w:name="logging-and-monitoring"/>
+    <w:bookmarkEnd w:id="85"/>
+    <w:bookmarkEnd w:id="86"/>
+    <w:bookmarkStart w:id="89" w:name="logging-and-monitoring"/>
     <w:p>
       <w:pPr>
         <w:pStyle w:val="Heading1"/>
@@ -4965,7 +5223,7 @@
         <w:t xml:space="preserve">10. Logging and Monitoring</w:t>
       </w:r>
     </w:p>
-    <w:bookmarkStart w:id="75" w:name="radius-accounting-to-sentinel"/>
+    <w:bookmarkStart w:id="87" w:name="radius-accounting-to-sentinel"/>
     <w:p>
       <w:pPr>
         <w:pStyle w:val="Heading2"/>
@@ -5090,8 +5348,8 @@
         <w:t xml:space="preserve">— a complete audit trail of every device identity assertion and its outcome.</w:t>
       </w:r>
     </w:p>
-    <w:bookmarkEnd w:id="75"/>
-    <w:bookmarkStart w:id="76" w:name="sentinel-analytics-rules-for-nac"/>
+    <w:bookmarkEnd w:id="87"/>
+    <w:bookmarkStart w:id="88" w:name="sentinel-analytics-rules-for-nac"/>
     <w:p>
       <w:pPr>
         <w:pStyle w:val="Heading2"/>
@@ -5402,9 +5660,9 @@
         <w:t xml:space="preserve">The certificate fingerprint mismatch rule is the operational detection for certificate theft: if a valid device certificate is presented from a MAC address that does not match the enrolled device’s MAC, Sentinel generates a High-severity alert and the CoA agent immediately quarantines the port.</w:t>
       </w:r>
     </w:p>
-    <w:bookmarkEnd w:id="76"/>
-    <w:bookmarkEnd w:id="77"/>
-    <w:bookmarkStart w:id="86" w:name="phased-implementation"/>
+    <w:bookmarkEnd w:id="88"/>
+    <w:bookmarkEnd w:id="89"/>
+    <w:bookmarkStart w:id="98" w:name="phased-implementation"/>
     <w:p>
       <w:pPr>
         <w:pStyle w:val="Heading1"/>
@@ -5434,7 +5692,7 @@
       <w:tr>
         <w:tc>
           <w:tcPr/>
-          <w:bookmarkStart w:id="81" w:name="fig-nac06"/>
+          <w:bookmarkStart w:id="93" w:name="fig-nac06"/>
           <w:p>
             <w:pPr>
               <w:pStyle w:val="Compact"/>
@@ -5445,18 +5703,18 @@
                 <wp:inline>
                   <wp:extent cx="5334000" cy="3000375"/>
                   <wp:effectExtent b="0" l="0" r="0" t="0"/>
-                  <wp:docPr descr="" title="" id="79" name="Picture"/>
+                  <wp:docPr descr="" title="" id="91" name="Picture"/>
                   <a:graphic>
                     <a:graphicData uri="http://schemas.openxmlformats.org/drawingml/2006/picture">
                       <pic:pic>
                         <pic:nvPicPr>
-                          <pic:cNvPr descr="figs/nac-fig-06-deployment-phases.png" id="80" name="Picture"/>
+                          <pic:cNvPr descr="figs/nac-fig-06-deployment-phases.png" id="92" name="Picture"/>
                           <pic:cNvPicPr>
                             <a:picLocks noChangeArrowheads="1" noChangeAspect="1"/>
                           </pic:cNvPicPr>
                         </pic:nvPicPr>
                         <pic:blipFill>
-                          <a:blip r:embed="rId78"/>
+                          <a:blip r:embed="rId90"/>
                           <a:stretch>
                             <a:fillRect/>
                           </a:stretch>
@@ -5493,14 +5751,14 @@
               <w:pStyle w:val="ImageCaption"/>
             </w:pPr>
             <w:r>
-              <w:t xml:space="preserve">Figure 6: NAC phased deployment timeline showing monitor mode, wired enforcement, wireless enforcement, and IoT segmentation phases with key milestones</w:t>
-            </w:r>
-          </w:p>
-          <w:bookmarkEnd w:id="81"/>
+              <w:t xml:space="preserve">Figure 9: NAC phased deployment timeline showing monitor mode, wired enforcement, wireless enforcement, and IoT segmentation phases with key milestones</w:t>
+            </w:r>
+          </w:p>
+          <w:bookmarkEnd w:id="93"/>
         </w:tc>
       </w:tr>
     </w:tbl>
-    <w:bookmarkStart w:id="82" w:name="phase-1-monitor-mode-weeks-14"/>
+    <w:bookmarkStart w:id="94" w:name="phase-1-monitor-mode-weeks-14"/>
     <w:p>
       <w:pPr>
         <w:pStyle w:val="Heading2"/>
@@ -5693,8 +5951,8 @@
         <w:t xml:space="preserve">This report is the baseline for Phase 2 readiness.</w:t>
       </w:r>
     </w:p>
-    <w:bookmarkEnd w:id="82"/>
-    <w:bookmarkStart w:id="83" w:name="phase-2-wired-enforcement-weeks-510"/>
+    <w:bookmarkEnd w:id="94"/>
+    <w:bookmarkStart w:id="95" w:name="phase-2-wired-enforcement-weeks-510"/>
     <w:p>
       <w:pPr>
         <w:pStyle w:val="Heading2"/>
@@ -5794,8 +6052,8 @@
         <w:t xml:space="preserve">Enable the Sentinel analytics rules and configure alert routing to the SSA SOC.</w:t>
       </w:r>
     </w:p>
-    <w:bookmarkEnd w:id="83"/>
-    <w:bookmarkStart w:id="84" w:name="phase-3-wireless-enforcement-weeks-1114"/>
+    <w:bookmarkEnd w:id="95"/>
+    <w:bookmarkStart w:id="96" w:name="phase-3-wireless-enforcement-weeks-1114"/>
     <w:p>
       <w:pPr>
         <w:pStyle w:val="Heading2"/>
@@ -5868,8 +6126,8 @@
         <w:t xml:space="preserve">The guest SSID is deployed in parallel, isolated on VLAN 500, with captive portal acknowledgment required for first-time access.</w:t>
       </w:r>
     </w:p>
-    <w:bookmarkEnd w:id="84"/>
-    <w:bookmarkStart w:id="85" w:name="X18aafc1ddc00ee7cd41bea8803075116ceb7de4"/>
+    <w:bookmarkEnd w:id="96"/>
+    <w:bookmarkStart w:id="97" w:name="X18aafc1ddc00ee7cd41bea8803075116ceb7de4"/>
     <w:p>
       <w:pPr>
         <w:pStyle w:val="Heading2"/>
@@ -5922,9 +6180,9 @@
         <w:t xml:space="preserve">Conduct a tabletop exercise simulating a rogue device plugged into a conference room port — verify that the quarantine VLAN fires, Sentinel alerts, and the CoA agent responds correctly.</w:t>
       </w:r>
     </w:p>
-    <w:bookmarkEnd w:id="85"/>
-    <w:bookmarkEnd w:id="86"/>
-    <w:bookmarkStart w:id="93" w:name="nist-sp-800-53-rev-5-control-closure"/>
+    <w:bookmarkEnd w:id="97"/>
+    <w:bookmarkEnd w:id="98"/>
+    <w:bookmarkStart w:id="105" w:name="nist-sp-800-53-rev-5-control-closure"/>
     <w:p>
       <w:pPr>
         <w:pStyle w:val="Heading1"/>
@@ -5954,7 +6212,7 @@
       <w:tr>
         <w:tc>
           <w:tcPr/>
-          <w:bookmarkStart w:id="90" w:name="fig-nac07"/>
+          <w:bookmarkStart w:id="102" w:name="fig-nac07"/>
           <w:p>
             <w:pPr>
               <w:pStyle w:val="Compact"/>
@@ -5965,18 +6223,18 @@
                 <wp:inline>
                   <wp:extent cx="5334000" cy="3000375"/>
                   <wp:effectExtent b="0" l="0" r="0" t="0"/>
-                  <wp:docPr descr="" title="" id="88" name="Picture"/>
+                  <wp:docPr descr="" title="" id="100" name="Picture"/>
                   <a:graphic>
                     <a:graphicData uri="http://schemas.openxmlformats.org/drawingml/2006/picture">
                       <pic:pic>
                         <pic:nvPicPr>
-                          <pic:cNvPr descr="figs/nac-fig-07-nist-closure.png" id="89" name="Picture"/>
+                          <pic:cNvPr descr="figs/nac-fig-07-nist-closure.png" id="101" name="Picture"/>
                           <pic:cNvPicPr>
                             <a:picLocks noChangeArrowheads="1" noChangeAspect="1"/>
                           </pic:cNvPicPr>
                         </pic:nvPicPr>
                         <pic:blipFill>
-                          <a:blip r:embed="rId87"/>
+                          <a:blip r:embed="rId99"/>
                           <a:stretch>
                             <a:fillRect/>
                           </a:stretch>
@@ -6013,10 +6271,10 @@
               <w:pStyle w:val="ImageCaption"/>
             </w:pPr>
             <w:r>
-              <w:t xml:space="preserve">Figure 7: NIST control closure for Part 2 NAC showing before and after state for IA, AC, SC, and CM controls</w:t>
-            </w:r>
-          </w:p>
-          <w:bookmarkEnd w:id="90"/>
+              <w:t xml:space="preserve">Figure 10: NIST control closure for Part 2 NAC showing before and after state for IA, AC, SC, and CM controls</w:t>
+            </w:r>
+          </w:p>
+          <w:bookmarkEnd w:id="102"/>
         </w:tc>
       </w:tr>
     </w:tbl>
@@ -6921,12 +7179,12 @@
                 <wp:inline>
                   <wp:extent cx="152400" cy="152400"/>
                   <wp:effectExtent b="0" l="0" r="0" t="0"/>
-                  <wp:docPr descr="" title="" id="91" name="Picture"/>
+                  <wp:docPr descr="" title="" id="103" name="Picture"/>
                   <a:graphic>
                     <a:graphicData uri="http://schemas.openxmlformats.org/drawingml/2006/picture">
                       <pic:pic>
                         <pic:nvPicPr>
-                          <pic:cNvPr descr="/opt/quarto/share/formats/docx/note.png" id="92" name="Picture"/>
+                          <pic:cNvPr descr="C:\Program Files\Quarto\share\formats\docx\note.png" id="104" name="Picture"/>
                           <pic:cNvPicPr>
                             <a:picLocks noChangeArrowheads="1" noChangeAspect="1"/>
                           </pic:cNvPicPr>
@@ -7072,8 +7330,8 @@
         </w:tc>
       </w:tr>
     </w:tbl>
-    <w:bookmarkEnd w:id="93"/>
-    <w:bookmarkStart w:id="94" w:name="X25d62fe4d5b3b6a277d70e03f7a7be09e83037f"/>
+    <w:bookmarkEnd w:id="105"/>
+    <w:bookmarkStart w:id="106" w:name="X25d62fe4d5b3b6a277d70e03f7a7be09e83037f"/>
     <w:p>
       <w:pPr>
         <w:pStyle w:val="Heading1"/>
@@ -7154,7 +7412,7 @@
         <w:t xml:space="preserve">Federal Application-Aware Networking — Part 2 of the series. Part 1 established the authoritative naming and addressing plane; Part 2 lays the device identity substrate on top of it, closing the device identity gap at the network port before any higher-layer identity assertion is made. Part 3 builds the certificate and token identity plane on this substrate, and Parts 5 through 19 carry those identities through transport, applications, operations, and the authorization package. Together the nineteen parts provide self-assessed evidence for all 29 FedRAMP 20x CR26 KSIs and 106+ NIST SP 800-53 Rev 5 controls pending independent 3PAO validation.</w:t>
       </w:r>
     </w:p>
-    <w:bookmarkEnd w:id="94"/>
+    <w:bookmarkEnd w:id="106"/>
     <w:sectPr>
       <w:footnotePr>
         <w:numRestart w:val="eachSect"/>

</xml_diff>